<commit_message>
Updated the observer participants
</commit_message>
<xml_diff>
--- a/Prac4.docx
+++ b/Prac4.docx
@@ -1,6 +1,6 @@
 
 <file path=word/document.xml><?xml version="1.0" encoding="utf-8"?>
-<w:document xmlns:wpc="http://schemas.microsoft.com/office/word/2010/wordprocessingCanvas" xmlns:cx="http://schemas.microsoft.com/office/drawing/2014/chartex" xmlns:cx1="http://schemas.microsoft.com/office/drawing/2015/9/8/chartex" xmlns:cx2="http://schemas.microsoft.com/office/drawing/2015/10/21/chartex" xmlns:cx3="http://schemas.microsoft.com/office/drawing/2016/5/9/chartex" xmlns:cx4="http://schemas.microsoft.com/office/drawing/2016/5/10/chartex" xmlns:cx5="http://schemas.microsoft.com/office/drawing/2016/5/11/chartex" xmlns:cx6="http://schemas.microsoft.com/office/drawing/2016/5/12/chartex" xmlns:cx7="http://schemas.microsoft.com/office/drawing/2016/5/13/chartex" xmlns:cx8="http://schemas.microsoft.com/office/drawing/2016/5/14/chartex" xmlns:mc="http://schemas.openxmlformats.org/markup-compatibility/2006" xmlns:aink="http://schemas.microsoft.com/office/drawing/2016/ink" xmlns:am3d="http://schemas.microsoft.com/office/drawing/2017/model3d" xmlns:o="urn:schemas-microsoft-com:office:office" xmlns:oel="http://schemas.microsoft.com/office/2019/extlst" xmlns:r="http://schemas.openxmlformats.org/officeDocument/2006/relationships" xmlns:m="http://schemas.openxmlformats.org/officeDocument/2006/math" xmlns:v="urn:schemas-microsoft-com:vml" xmlns:wp14="http://schemas.microsoft.com/office/word/2010/wordprocessingDrawing" xmlns:wp="http://schemas.openxmlformats.org/drawingml/2006/wordprocessingDrawing" xmlns:w10="urn:schemas-microsoft-com:office:word" xmlns:w="http://schemas.openxmlformats.org/wordprocessingml/2006/main" xmlns:w14="http://schemas.microsoft.com/office/word/2010/wordml" xmlns:w15="http://schemas.microsoft.com/office/word/2012/wordml" xmlns:w16cei="http://schemas.microsoft.com/office/word/2026/wordml/cei" xmlns:w16cex="http://schemas.microsoft.com/office/word/2018/wordml/cex" xmlns:w16cid="http://schemas.microsoft.com/office/word/2016/wordml/cid" xmlns:w16="http://schemas.microsoft.com/office/word/2018/wordml" xmlns:w16du="http://schemas.microsoft.com/office/word/2023/wordml/word16du" xmlns:w16sdtdh="http://schemas.microsoft.com/office/word/2020/wordml/sdtdatahash" xmlns:w16sdtfl="http://schemas.microsoft.com/office/word/2024/wordml/sdtformatlock" xmlns:w16se="http://schemas.microsoft.com/office/word/2015/wordml/symex" xmlns:wpg="http://schemas.microsoft.com/office/word/2010/wordprocessingGroup" xmlns:wpi="http://schemas.microsoft.com/office/word/2010/wordprocessingInk" xmlns:wne="http://schemas.microsoft.com/office/word/2006/wordml" xmlns:wps="http://schemas.microsoft.com/office/word/2010/wordprocessingShape" mc:Ignorable="w14 w15 w16se w16cid w16 w16cex w16sdtdh w16sdtfl w16du wp14">
+<w:document xmlns:wpc="http://schemas.microsoft.com/office/word/2010/wordprocessingCanvas" xmlns:cx="http://schemas.microsoft.com/office/drawing/2014/chartex" xmlns:cx1="http://schemas.microsoft.com/office/drawing/2015/9/8/chartex" xmlns:cx2="http://schemas.microsoft.com/office/drawing/2015/10/21/chartex" xmlns:cx3="http://schemas.microsoft.com/office/drawing/2016/5/9/chartex" xmlns:cx4="http://schemas.microsoft.com/office/drawing/2016/5/10/chartex" xmlns:cx5="http://schemas.microsoft.com/office/drawing/2016/5/11/chartex" xmlns:cx6="http://schemas.microsoft.com/office/drawing/2016/5/12/chartex" xmlns:cx7="http://schemas.microsoft.com/office/drawing/2016/5/13/chartex" xmlns:cx8="http://schemas.microsoft.com/office/drawing/2016/5/14/chartex" xmlns:mc="http://schemas.openxmlformats.org/markup-compatibility/2006" xmlns:aink="http://schemas.microsoft.com/office/drawing/2016/ink" xmlns:am3d="http://schemas.microsoft.com/office/drawing/2017/model3d" xmlns:o="urn:schemas-microsoft-com:office:office" xmlns:oel="http://schemas.microsoft.com/office/2019/extlst" xmlns:r="http://schemas.openxmlformats.org/officeDocument/2006/relationships" xmlns:m="http://schemas.openxmlformats.org/officeDocument/2006/math" xmlns:v="urn:schemas-microsoft-com:vml" xmlns:wp14="http://schemas.microsoft.com/office/word/2010/wordprocessingDrawing" xmlns:wp="http://schemas.openxmlformats.org/drawingml/2006/wordprocessingDrawing" xmlns:w10="urn:schemas-microsoft-com:office:word" xmlns:w="http://schemas.openxmlformats.org/wordprocessingml/2006/main" xmlns:w14="http://schemas.microsoft.com/office/word/2010/wordml" xmlns:w15="http://schemas.microsoft.com/office/word/2012/wordml" xmlns:w16cex="http://schemas.microsoft.com/office/word/2018/wordml/cex" xmlns:w16cid="http://schemas.microsoft.com/office/word/2016/wordml/cid" xmlns:w16="http://schemas.microsoft.com/office/word/2018/wordml" xmlns:w16du="http://schemas.microsoft.com/office/word/2023/wordml/word16du" xmlns:w16sdtdh="http://schemas.microsoft.com/office/word/2020/wordml/sdtdatahash" xmlns:w16sdtfl="http://schemas.microsoft.com/office/word/2024/wordml/sdtformatlock" xmlns:w16se="http://schemas.microsoft.com/office/word/2015/wordml/symex" xmlns:wpg="http://schemas.microsoft.com/office/word/2010/wordprocessingGroup" xmlns:wpi="http://schemas.microsoft.com/office/word/2010/wordprocessingInk" xmlns:wne="http://schemas.microsoft.com/office/word/2006/wordml" xmlns:wps="http://schemas.microsoft.com/office/word/2010/wordprocessingShape" mc:Ignorable="w14 w15 w16se w16cid w16 w16cex w16sdtdh w16sdtfl w16du wp14">
   <w:body>
     <w:p>
       <w:pPr>
@@ -36,8 +36,13 @@
       </w:r>
     </w:p>
     <w:p>
-      <w:r>
-        <w:t>Thakasa Ngcobo: u25556526</w:t>
+      <w:proofErr w:type="spellStart"/>
+      <w:r>
+        <w:t>Thakasa</w:t>
+      </w:r>
+      <w:proofErr w:type="spellEnd"/>
+      <w:r>
+        <w:t xml:space="preserve"> Ngcobo: u25556526</w:t>
       </w:r>
     </w:p>
     <w:p>
@@ -80,8 +85,13 @@
       </w:r>
     </w:p>
     <w:p>
-      <w:r>
-        <w:t>TaskForge is applied to automotive manufacturing: a factory processes Production</w:t>
+      <w:proofErr w:type="spellStart"/>
+      <w:r>
+        <w:t>TaskForge</w:t>
+      </w:r>
+      <w:proofErr w:type="spellEnd"/>
+      <w:r>
+        <w:t xml:space="preserve"> is applied to automotive manufacturing: a factory processes Production</w:t>
       </w:r>
       <w:r>
         <w:t xml:space="preserve"> </w:t>
@@ -138,7 +148,15 @@
     </w:p>
     <w:p>
       <w:r>
-        <w:t>*will be done later</w:t>
+        <w:t>*</w:t>
+      </w:r>
+      <w:proofErr w:type="gramStart"/>
+      <w:r>
+        <w:t>will</w:t>
+      </w:r>
+      <w:proofErr w:type="gramEnd"/>
+      <w:r>
+        <w:t xml:space="preserve"> be done later</w:t>
       </w:r>
     </w:p>
     <w:p/>
@@ -152,6 +170,7 @@
           <w:u w:val="single"/>
         </w:rPr>
       </w:pPr>
+      <w:proofErr w:type="spellStart"/>
       <w:r>
         <w:rPr>
           <w:b/>
@@ -160,7 +179,18 @@
           <w:szCs w:val="28"/>
           <w:u w:val="single"/>
         </w:rPr>
-        <w:t>GoF participants:</w:t>
+        <w:t>GoF</w:t>
+      </w:r>
+      <w:proofErr w:type="spellEnd"/>
+      <w:r>
+        <w:rPr>
+          <w:b/>
+          <w:bCs/>
+          <w:sz w:val="28"/>
+          <w:szCs w:val="28"/>
+          <w:u w:val="single"/>
+        </w:rPr>
+        <w:t xml:space="preserve"> participants:</w:t>
       </w:r>
     </w:p>
     <w:p>
@@ -209,7 +239,15 @@
         <w:t xml:space="preserve">: </w:t>
       </w:r>
       <w:r>
-        <w:t xml:space="preserve"> WorkComponent (Abstract class)</w:t>
+        <w:t xml:space="preserve"> </w:t>
+      </w:r>
+      <w:proofErr w:type="spellStart"/>
+      <w:r>
+        <w:t>WorkComponent</w:t>
+      </w:r>
+      <w:proofErr w:type="spellEnd"/>
+      <w:r>
+        <w:t xml:space="preserve"> (Abstract class)</w:t>
       </w:r>
     </w:p>
     <w:p>
@@ -237,16 +275,74 @@
         <w:t xml:space="preserve">: </w:t>
       </w:r>
       <w:r>
-        <w:t xml:space="preserve"> SubAssembly </w:t>
-      </w:r>
-      <w:r>
-        <w:t xml:space="preserve">and its subclasses (ProductionOrder, </w:t>
-      </w:r>
-      <w:r>
-        <w:t xml:space="preserve">MechanicalAssembly, ElectricalAssembly, PaintAndFinishAssembly, FrameSubGroup, SuspensionSubGroup, </w:t>
-      </w:r>
-      <w:r>
-        <w:t>FinishingSubGroup)</w:t>
+        <w:t xml:space="preserve"> </w:t>
+      </w:r>
+      <w:proofErr w:type="spellStart"/>
+      <w:r>
+        <w:t>SubAssembly</w:t>
+      </w:r>
+      <w:proofErr w:type="spellEnd"/>
+      <w:r>
+        <w:t xml:space="preserve"> </w:t>
+      </w:r>
+      <w:r>
+        <w:t>and its subclasses (</w:t>
+      </w:r>
+      <w:proofErr w:type="spellStart"/>
+      <w:r>
+        <w:t>ProductionOrder</w:t>
+      </w:r>
+      <w:proofErr w:type="spellEnd"/>
+      <w:r>
+        <w:t xml:space="preserve">, </w:t>
+      </w:r>
+      <w:proofErr w:type="spellStart"/>
+      <w:r>
+        <w:t>MechanicalAssembly</w:t>
+      </w:r>
+      <w:proofErr w:type="spellEnd"/>
+      <w:r>
+        <w:t xml:space="preserve">, </w:t>
+      </w:r>
+      <w:proofErr w:type="spellStart"/>
+      <w:r>
+        <w:t>ElectricalAssembly</w:t>
+      </w:r>
+      <w:proofErr w:type="spellEnd"/>
+      <w:r>
+        <w:t xml:space="preserve">, </w:t>
+      </w:r>
+      <w:proofErr w:type="spellStart"/>
+      <w:r>
+        <w:t>PaintAndFinishAssembly</w:t>
+      </w:r>
+      <w:proofErr w:type="spellEnd"/>
+      <w:r>
+        <w:t xml:space="preserve">, </w:t>
+      </w:r>
+      <w:proofErr w:type="spellStart"/>
+      <w:r>
+        <w:t>FrameSubGroup</w:t>
+      </w:r>
+      <w:proofErr w:type="spellEnd"/>
+      <w:r>
+        <w:t xml:space="preserve">, </w:t>
+      </w:r>
+      <w:proofErr w:type="spellStart"/>
+      <w:r>
+        <w:t>SuspensionSubGroup</w:t>
+      </w:r>
+      <w:proofErr w:type="spellEnd"/>
+      <w:r>
+        <w:t xml:space="preserve">, </w:t>
+      </w:r>
+      <w:proofErr w:type="spellStart"/>
+      <w:r>
+        <w:t>FinishingSubGroup</w:t>
+      </w:r>
+      <w:proofErr w:type="spellEnd"/>
+      <w:r>
+        <w:t>)</w:t>
       </w:r>
     </w:p>
     <w:p>
@@ -276,8 +372,37 @@
       <w:r>
         <w:t xml:space="preserve"> Operation and its subclasses (</w:t>
       </w:r>
-      <w:r>
-        <w:t>WeldingOperation, InspectionOperation, AssemblyOperation, PaintingOperation)</w:t>
+      <w:proofErr w:type="spellStart"/>
+      <w:r>
+        <w:t>WeldingOperation</w:t>
+      </w:r>
+      <w:proofErr w:type="spellEnd"/>
+      <w:r>
+        <w:t xml:space="preserve">, </w:t>
+      </w:r>
+      <w:proofErr w:type="spellStart"/>
+      <w:r>
+        <w:t>InspectionOperation</w:t>
+      </w:r>
+      <w:proofErr w:type="spellEnd"/>
+      <w:r>
+        <w:t xml:space="preserve">, </w:t>
+      </w:r>
+      <w:proofErr w:type="spellStart"/>
+      <w:r>
+        <w:t>AssemblyOperation</w:t>
+      </w:r>
+      <w:proofErr w:type="spellEnd"/>
+      <w:r>
+        <w:t xml:space="preserve">, </w:t>
+      </w:r>
+      <w:proofErr w:type="spellStart"/>
+      <w:r>
+        <w:t>PaintingOperation</w:t>
+      </w:r>
+      <w:proofErr w:type="spellEnd"/>
+      <w:r>
+        <w:t>)</w:t>
       </w:r>
     </w:p>
     <w:p>
@@ -329,6 +454,14 @@
         </w:rPr>
         <w:t>Component:</w:t>
       </w:r>
+      <w:r>
+        <w:t xml:space="preserve"> </w:t>
+      </w:r>
+      <w:proofErr w:type="spellStart"/>
+      <w:r>
+        <w:t>WorkComponent</w:t>
+      </w:r>
+      <w:proofErr w:type="spellEnd"/>
     </w:p>
     <w:p>
       <w:pPr>
@@ -342,6 +475,7 @@
           <w:bCs/>
         </w:rPr>
       </w:pPr>
+      <w:proofErr w:type="spellStart"/>
       <w:r>
         <w:rPr>
           <w:i/>
@@ -349,8 +483,33 @@
           <w:u w:val="single"/>
         </w:rPr>
         <w:lastRenderedPageBreak/>
-        <w:t>ConcreteComponent:</w:t>
-      </w:r>
+        <w:t>ConcreteComponent</w:t>
+      </w:r>
+      <w:proofErr w:type="spellEnd"/>
+      <w:r>
+        <w:rPr>
+          <w:i/>
+          <w:iCs/>
+          <w:u w:val="single"/>
+        </w:rPr>
+        <w:t>:</w:t>
+      </w:r>
+      <w:r>
+        <w:rPr>
+          <w:i/>
+          <w:iCs/>
+          <w:u w:val="single"/>
+        </w:rPr>
+        <w:t xml:space="preserve"> </w:t>
+      </w:r>
+      <w:r>
+        <w:t xml:space="preserve">Operation, </w:t>
+      </w:r>
+      <w:proofErr w:type="spellStart"/>
+      <w:r>
+        <w:t>SubAssembly</w:t>
+      </w:r>
+      <w:proofErr w:type="spellEnd"/>
     </w:p>
     <w:p>
       <w:pPr>
@@ -372,6 +531,17 @@
         </w:rPr>
         <w:t>Decorator:</w:t>
       </w:r>
+      <w:r>
+        <w:rPr>
+          <w:i/>
+          <w:iCs/>
+          <w:u w:val="single"/>
+        </w:rPr>
+        <w:t xml:space="preserve"> </w:t>
+      </w:r>
+      <w:r>
+        <w:t>Decorator</w:t>
+      </w:r>
     </w:p>
     <w:p>
       <w:pPr>
@@ -385,14 +555,37 @@
           <w:bCs/>
         </w:rPr>
       </w:pPr>
+      <w:proofErr w:type="spellStart"/>
       <w:r>
         <w:rPr>
           <w:i/>
           <w:iCs/>
           <w:u w:val="single"/>
         </w:rPr>
-        <w:t xml:space="preserve">ConcreteDecorator: </w:t>
-      </w:r>
+        <w:t>ConcreteDecorator</w:t>
+      </w:r>
+      <w:proofErr w:type="spellEnd"/>
+      <w:r>
+        <w:rPr>
+          <w:i/>
+          <w:iCs/>
+          <w:u w:val="single"/>
+        </w:rPr>
+        <w:t xml:space="preserve">: </w:t>
+      </w:r>
+      <w:proofErr w:type="spellStart"/>
+      <w:r>
+        <w:t>PriorityDecorator</w:t>
+      </w:r>
+      <w:proofErr w:type="spellEnd"/>
+      <w:r>
+        <w:t xml:space="preserve">, </w:t>
+      </w:r>
+      <w:proofErr w:type="spellStart"/>
+      <w:r>
+        <w:t>FragileDecorator</w:t>
+      </w:r>
+      <w:proofErr w:type="spellEnd"/>
     </w:p>
     <w:p>
       <w:pPr>
@@ -455,13 +648,23 @@
           <w:bCs/>
         </w:rPr>
       </w:pPr>
+      <w:proofErr w:type="spellStart"/>
       <w:r>
         <w:rPr>
           <w:i/>
           <w:iCs/>
           <w:u w:val="single"/>
         </w:rPr>
-        <w:t xml:space="preserve">ConcreteIterator: </w:t>
+        <w:t>ConcreteIterator</w:t>
+      </w:r>
+      <w:proofErr w:type="spellEnd"/>
+      <w:r>
+        <w:rPr>
+          <w:i/>
+          <w:iCs/>
+          <w:u w:val="single"/>
+        </w:rPr>
+        <w:t xml:space="preserve">: </w:t>
       </w:r>
     </w:p>
     <w:p>
@@ -497,13 +700,23 @@
           <w:bCs/>
         </w:rPr>
       </w:pPr>
+      <w:proofErr w:type="spellStart"/>
       <w:r>
         <w:rPr>
           <w:i/>
           <w:iCs/>
           <w:u w:val="single"/>
         </w:rPr>
-        <w:t>ConcreteAggregate:</w:t>
+        <w:t>ConcreteAggregate</w:t>
+      </w:r>
+      <w:proofErr w:type="spellEnd"/>
+      <w:r>
+        <w:rPr>
+          <w:i/>
+          <w:iCs/>
+          <w:u w:val="single"/>
+        </w:rPr>
+        <w:t>:</w:t>
       </w:r>
     </w:p>
     <w:p>
@@ -567,13 +780,23 @@
           <w:bCs/>
         </w:rPr>
       </w:pPr>
+      <w:proofErr w:type="spellStart"/>
       <w:r>
         <w:rPr>
           <w:i/>
           <w:iCs/>
           <w:u w:val="single"/>
         </w:rPr>
-        <w:t>ConcreteState:</w:t>
+        <w:t>ConcreteState</w:t>
+      </w:r>
+      <w:proofErr w:type="spellEnd"/>
+      <w:r>
+        <w:rPr>
+          <w:i/>
+          <w:iCs/>
+          <w:u w:val="single"/>
+        </w:rPr>
+        <w:t>:</w:t>
       </w:r>
     </w:p>
     <w:p>
@@ -651,12 +874,19 @@
           <w:numId w:val="3"/>
         </w:numPr>
       </w:pPr>
-      <w:r>
-        <w:t xml:space="preserve">SubAssembly and operation inherit from </w:t>
-      </w:r>
+      <w:proofErr w:type="spellStart"/>
+      <w:r>
+        <w:t>SubAssembly</w:t>
+      </w:r>
+      <w:proofErr w:type="spellEnd"/>
+      <w:r>
+        <w:t xml:space="preserve"> and operation inherit from </w:t>
+      </w:r>
+      <w:proofErr w:type="spellStart"/>
       <w:r>
         <w:t>WorkComponent</w:t>
       </w:r>
+      <w:proofErr w:type="spellEnd"/>
     </w:p>
     <w:p/>
     <w:p>
@@ -684,8 +914,13 @@
           <w:numId w:val="3"/>
         </w:numPr>
       </w:pPr>
-      <w:r>
-        <w:t xml:space="preserve">SubAssembly </w:t>
+      <w:proofErr w:type="spellStart"/>
+      <w:r>
+        <w:t>SubAssembly</w:t>
+      </w:r>
+      <w:proofErr w:type="spellEnd"/>
+      <w:r>
+        <w:t xml:space="preserve"> </w:t>
       </w:r>
       <w:r>
         <w:rPr>
@@ -695,7 +930,15 @@
         <w:t>has-a</w:t>
       </w:r>
       <w:r>
-        <w:t xml:space="preserve"> collection of WorkComponent’s </w:t>
+        <w:t xml:space="preserve"> collection of </w:t>
+      </w:r>
+      <w:proofErr w:type="spellStart"/>
+      <w:r>
+        <w:t>WorkComponent’s</w:t>
+      </w:r>
+      <w:proofErr w:type="spellEnd"/>
+      <w:r>
+        <w:t xml:space="preserve"> </w:t>
       </w:r>
     </w:p>
     <w:p/>
@@ -725,20 +968,45 @@
         </w:numPr>
       </w:pPr>
       <w:r>
-        <w:t>One SubAssembly to</w:t>
+        <w:t xml:space="preserve">One </w:t>
+      </w:r>
+      <w:proofErr w:type="spellStart"/>
+      <w:r>
+        <w:t>SubAssembly</w:t>
+      </w:r>
+      <w:proofErr w:type="spellEnd"/>
+      <w:r>
+        <w:t xml:space="preserve"> to</w:t>
       </w:r>
       <w:r>
         <w:t xml:space="preserve"> </w:t>
       </w:r>
+      <w:proofErr w:type="gramStart"/>
       <w:r>
         <w:rPr>
           <w:i/>
           <w:iCs/>
         </w:rPr>
-        <w:t>0..*</w:t>
-      </w:r>
-      <w:r>
-        <w:t xml:space="preserve"> WorkComponent children</w:t>
+        <w:t>0..</w:t>
+      </w:r>
+      <w:proofErr w:type="gramEnd"/>
+      <w:r>
+        <w:rPr>
+          <w:i/>
+          <w:iCs/>
+        </w:rPr>
+        <w:t>*</w:t>
+      </w:r>
+      <w:r>
+        <w:t xml:space="preserve"> </w:t>
+      </w:r>
+      <w:proofErr w:type="spellStart"/>
+      <w:r>
+        <w:t>WorkComponent</w:t>
+      </w:r>
+      <w:proofErr w:type="spellEnd"/>
+      <w:r>
+        <w:t xml:space="preserve"> children</w:t>
       </w:r>
     </w:p>
     <w:p/>
@@ -767,8 +1035,13 @@
           <w:numId w:val="3"/>
         </w:numPr>
       </w:pPr>
-      <w:r>
-        <w:t>SubAssembly owns its children and is responsible for their deletion</w:t>
+      <w:proofErr w:type="spellStart"/>
+      <w:r>
+        <w:t>SubAssembly</w:t>
+      </w:r>
+      <w:proofErr w:type="spellEnd"/>
+      <w:r>
+        <w:t xml:space="preserve"> owns its children and is responsible for their deletion</w:t>
       </w:r>
     </w:p>
     <w:p>
@@ -819,7 +1092,15 @@
     </w:p>
     <w:p>
       <w:r>
-        <w:t>*will be done later</w:t>
+        <w:t>*</w:t>
+      </w:r>
+      <w:proofErr w:type="gramStart"/>
+      <w:r>
+        <w:t>will</w:t>
+      </w:r>
+      <w:proofErr w:type="gramEnd"/>
+      <w:r>
+        <w:t xml:space="preserve"> be done later</w:t>
       </w:r>
     </w:p>
     <w:p/>
@@ -844,7 +1125,7 @@
 </file>
 
 <file path=word/numbering.xml><?xml version="1.0" encoding="utf-8"?>
-<w:numbering xmlns:wpc="http://schemas.microsoft.com/office/word/2010/wordprocessingCanvas" xmlns:cx="http://schemas.microsoft.com/office/drawing/2014/chartex" xmlns:cx1="http://schemas.microsoft.com/office/drawing/2015/9/8/chartex" xmlns:cx2="http://schemas.microsoft.com/office/drawing/2015/10/21/chartex" xmlns:cx3="http://schemas.microsoft.com/office/drawing/2016/5/9/chartex" xmlns:cx4="http://schemas.microsoft.com/office/drawing/2016/5/10/chartex" xmlns:cx5="http://schemas.microsoft.com/office/drawing/2016/5/11/chartex" xmlns:cx6="http://schemas.microsoft.com/office/drawing/2016/5/12/chartex" xmlns:cx7="http://schemas.microsoft.com/office/drawing/2016/5/13/chartex" xmlns:cx8="http://schemas.microsoft.com/office/drawing/2016/5/14/chartex" xmlns:mc="http://schemas.openxmlformats.org/markup-compatibility/2006" xmlns:aink="http://schemas.microsoft.com/office/drawing/2016/ink" xmlns:am3d="http://schemas.microsoft.com/office/drawing/2017/model3d" xmlns:o="urn:schemas-microsoft-com:office:office" xmlns:oel="http://schemas.microsoft.com/office/2019/extlst" xmlns:r="http://schemas.openxmlformats.org/officeDocument/2006/relationships" xmlns:m="http://schemas.openxmlformats.org/officeDocument/2006/math" xmlns:v="urn:schemas-microsoft-com:vml" xmlns:wp14="http://schemas.microsoft.com/office/word/2010/wordprocessingDrawing" xmlns:wp="http://schemas.openxmlformats.org/drawingml/2006/wordprocessingDrawing" xmlns:w10="urn:schemas-microsoft-com:office:word" xmlns:w="http://schemas.openxmlformats.org/wordprocessingml/2006/main" xmlns:w14="http://schemas.microsoft.com/office/word/2010/wordml" xmlns:w15="http://schemas.microsoft.com/office/word/2012/wordml" xmlns:w16cei="http://schemas.microsoft.com/office/word/2026/wordml/cei" xmlns:w16cex="http://schemas.microsoft.com/office/word/2018/wordml/cex" xmlns:w16cid="http://schemas.microsoft.com/office/word/2016/wordml/cid" xmlns:w16="http://schemas.microsoft.com/office/word/2018/wordml" xmlns:w16du="http://schemas.microsoft.com/office/word/2023/wordml/word16du" xmlns:w16sdtdh="http://schemas.microsoft.com/office/word/2020/wordml/sdtdatahash" xmlns:w16sdtfl="http://schemas.microsoft.com/office/word/2024/wordml/sdtformatlock" xmlns:w16se="http://schemas.microsoft.com/office/word/2015/wordml/symex" xmlns:wpg="http://schemas.microsoft.com/office/word/2010/wordprocessingGroup" xmlns:wpi="http://schemas.microsoft.com/office/word/2010/wordprocessingInk" xmlns:wne="http://schemas.microsoft.com/office/word/2006/wordml" xmlns:wps="http://schemas.microsoft.com/office/word/2010/wordprocessingShape" mc:Ignorable="w14 w15 w16se w16cid w16 w16cex w16sdtdh w16sdtfl w16du wp14">
+<w:numbering xmlns:wpc="http://schemas.microsoft.com/office/word/2010/wordprocessingCanvas" xmlns:cx="http://schemas.microsoft.com/office/drawing/2014/chartex" xmlns:cx1="http://schemas.microsoft.com/office/drawing/2015/9/8/chartex" xmlns:cx2="http://schemas.microsoft.com/office/drawing/2015/10/21/chartex" xmlns:cx3="http://schemas.microsoft.com/office/drawing/2016/5/9/chartex" xmlns:cx4="http://schemas.microsoft.com/office/drawing/2016/5/10/chartex" xmlns:cx5="http://schemas.microsoft.com/office/drawing/2016/5/11/chartex" xmlns:cx6="http://schemas.microsoft.com/office/drawing/2016/5/12/chartex" xmlns:cx7="http://schemas.microsoft.com/office/drawing/2016/5/13/chartex" xmlns:cx8="http://schemas.microsoft.com/office/drawing/2016/5/14/chartex" xmlns:mc="http://schemas.openxmlformats.org/markup-compatibility/2006" xmlns:aink="http://schemas.microsoft.com/office/drawing/2016/ink" xmlns:am3d="http://schemas.microsoft.com/office/drawing/2017/model3d" xmlns:o="urn:schemas-microsoft-com:office:office" xmlns:oel="http://schemas.microsoft.com/office/2019/extlst" xmlns:r="http://schemas.openxmlformats.org/officeDocument/2006/relationships" xmlns:m="http://schemas.openxmlformats.org/officeDocument/2006/math" xmlns:v="urn:schemas-microsoft-com:vml" xmlns:wp14="http://schemas.microsoft.com/office/word/2010/wordprocessingDrawing" xmlns:wp="http://schemas.openxmlformats.org/drawingml/2006/wordprocessingDrawing" xmlns:w10="urn:schemas-microsoft-com:office:word" xmlns:w="http://schemas.openxmlformats.org/wordprocessingml/2006/main" xmlns:w14="http://schemas.microsoft.com/office/word/2010/wordml" xmlns:w15="http://schemas.microsoft.com/office/word/2012/wordml" xmlns:w16cex="http://schemas.microsoft.com/office/word/2018/wordml/cex" xmlns:w16cid="http://schemas.microsoft.com/office/word/2016/wordml/cid" xmlns:w16="http://schemas.microsoft.com/office/word/2018/wordml" xmlns:w16du="http://schemas.microsoft.com/office/word/2023/wordml/word16du" xmlns:w16sdtdh="http://schemas.microsoft.com/office/word/2020/wordml/sdtdatahash" xmlns:w16sdtfl="http://schemas.microsoft.com/office/word/2024/wordml/sdtformatlock" xmlns:w16se="http://schemas.microsoft.com/office/word/2015/wordml/symex" xmlns:wpg="http://schemas.microsoft.com/office/word/2010/wordprocessingGroup" xmlns:wpi="http://schemas.microsoft.com/office/word/2010/wordprocessingInk" xmlns:wne="http://schemas.microsoft.com/office/word/2006/wordml" xmlns:wps="http://schemas.microsoft.com/office/word/2010/wordprocessingShape" mc:Ignorable="w14 w15 w16se w16cid w16 w16cex w16sdtdh w16sdtfl w16du wp14">
   <w:abstractNum w:abstractNumId="0" w15:restartNumberingAfterBreak="0">
     <w:nsid w:val="1B362117"/>
     <w:multiLevelType w:val="hybridMultilevel"/>
@@ -1775,6 +2056,7 @@
   <w:style w:type="character" w:default="1" w:styleId="DefaultParagraphFont">
     <w:name w:val="Default Paragraph Font"/>
     <w:uiPriority w:val="1"/>
+    <w:semiHidden/>
     <w:unhideWhenUsed/>
   </w:style>
   <w:style w:type="table" w:default="1" w:styleId="TableNormal">

</xml_diff>

<commit_message>
Added design rationale to pdf
</commit_message>
<xml_diff>
--- a/Prac4.docx
+++ b/Prac4.docx
@@ -148,15 +148,7 @@
     </w:p>
     <w:p>
       <w:r>
-        <w:t>*</w:t>
-      </w:r>
-      <w:proofErr w:type="gramStart"/>
-      <w:r>
-        <w:t>will</w:t>
-      </w:r>
-      <w:proofErr w:type="gramEnd"/>
-      <w:r>
-        <w:t xml:space="preserve"> be done later</w:t>
+        <w:t>*will be done later</w:t>
       </w:r>
     </w:p>
     <w:p/>
@@ -981,21 +973,12 @@
       <w:r>
         <w:t xml:space="preserve"> </w:t>
       </w:r>
-      <w:proofErr w:type="gramStart"/>
       <w:r>
         <w:rPr>
           <w:i/>
           <w:iCs/>
         </w:rPr>
-        <w:t>0..</w:t>
-      </w:r>
-      <w:proofErr w:type="gramEnd"/>
-      <w:r>
-        <w:rPr>
-          <w:i/>
-          <w:iCs/>
-        </w:rPr>
-        <w:t>*</w:t>
+        <w:t>0..*</w:t>
       </w:r>
       <w:r>
         <w:t xml:space="preserve"> </w:t>
@@ -1092,26 +1075,70 @@
     </w:p>
     <w:p>
       <w:r>
-        <w:t>*</w:t>
-      </w:r>
-      <w:proofErr w:type="gramStart"/>
-      <w:r>
-        <w:t>will</w:t>
-      </w:r>
-      <w:proofErr w:type="gramEnd"/>
-      <w:r>
-        <w:t xml:space="preserve"> be done later</w:t>
+        <w:t>Ownership:</w:t>
+      </w:r>
+    </w:p>
+    <w:p>
+      <w:r>
+        <w:t>The composite owns its children, so when it is deleted all of its children are as well.</w:t>
+      </w:r>
+    </w:p>
+    <w:p>
+      <w:r>
+        <w:t xml:space="preserve">The iterator should </w:t>
+      </w:r>
+      <w:r>
+        <w:t xml:space="preserve">either be </w:t>
+      </w:r>
+      <w:r>
+        <w:t>made on the stack or its deletion/deallocation should be handled by the main/client.</w:t>
+      </w:r>
+    </w:p>
+    <w:p>
+      <w:r>
+        <w:t>The leaves will delete/deallocate their state classes.</w:t>
+      </w:r>
+    </w:p>
+    <w:p>
+      <w:r>
+        <w:t xml:space="preserve">Observer will either be deleted by the client or if its parent </w:t>
+      </w:r>
+      <w:r>
+        <w:t>component is deleted will be deleted by the parent.</w:t>
       </w:r>
     </w:p>
     <w:p/>
     <w:p>
-      <w:pPr>
-        <w:rPr>
-          <w:b/>
-          <w:bCs/>
-          <w:u w:val="single"/>
-        </w:rPr>
-      </w:pPr>
+      <w:r>
+        <w:t>Other important decisions:</w:t>
+      </w:r>
+    </w:p>
+    <w:p>
+      <w:r>
+        <w:t xml:space="preserve">Iterator only applies to the </w:t>
+      </w:r>
+      <w:proofErr w:type="spellStart"/>
+      <w:r>
+        <w:t>SubAssembly</w:t>
+      </w:r>
+      <w:proofErr w:type="spellEnd"/>
+      <w:r>
+        <w:t xml:space="preserve"> (composite), as there is no point in it iterating over a leaf.</w:t>
+      </w:r>
+    </w:p>
+    <w:p>
+      <w:r>
+        <w:t xml:space="preserve">The decorator types are specifically urgent and fragile as these can fit together </w:t>
+      </w:r>
+      <w:r>
+        <w:t xml:space="preserve">smoothly, unlike a pair of </w:t>
+      </w:r>
+      <w:r>
+        <w:t xml:space="preserve">say </w:t>
+      </w:r>
+      <w:r>
+        <w:t>urgent and unimportant.</w:t>
+      </w:r>
     </w:p>
     <w:p/>
     <w:sectPr>

</xml_diff>

<commit_message>
Add UML with Composite pattern, to be updated with other patterns when possible.
</commit_message>
<xml_diff>
--- a/Prac4.docx
+++ b/Prac4.docx
@@ -1,6 +1,6 @@
 
 <file path=word/document.xml><?xml version="1.0" encoding="utf-8"?>
-<w:document xmlns:wpc="http://schemas.microsoft.com/office/word/2010/wordprocessingCanvas" xmlns:cx="http://schemas.microsoft.com/office/drawing/2014/chartex" xmlns:cx1="http://schemas.microsoft.com/office/drawing/2015/9/8/chartex" xmlns:cx2="http://schemas.microsoft.com/office/drawing/2015/10/21/chartex" xmlns:cx3="http://schemas.microsoft.com/office/drawing/2016/5/9/chartex" xmlns:cx4="http://schemas.microsoft.com/office/drawing/2016/5/10/chartex" xmlns:cx5="http://schemas.microsoft.com/office/drawing/2016/5/11/chartex" xmlns:cx6="http://schemas.microsoft.com/office/drawing/2016/5/12/chartex" xmlns:cx7="http://schemas.microsoft.com/office/drawing/2016/5/13/chartex" xmlns:cx8="http://schemas.microsoft.com/office/drawing/2016/5/14/chartex" xmlns:mc="http://schemas.openxmlformats.org/markup-compatibility/2006" xmlns:aink="http://schemas.microsoft.com/office/drawing/2016/ink" xmlns:am3d="http://schemas.microsoft.com/office/drawing/2017/model3d" xmlns:o="urn:schemas-microsoft-com:office:office" xmlns:oel="http://schemas.microsoft.com/office/2019/extlst" xmlns:r="http://schemas.openxmlformats.org/officeDocument/2006/relationships" xmlns:m="http://schemas.openxmlformats.org/officeDocument/2006/math" xmlns:v="urn:schemas-microsoft-com:vml" xmlns:wp14="http://schemas.microsoft.com/office/word/2010/wordprocessingDrawing" xmlns:wp="http://schemas.openxmlformats.org/drawingml/2006/wordprocessingDrawing" xmlns:w10="urn:schemas-microsoft-com:office:word" xmlns:w="http://schemas.openxmlformats.org/wordprocessingml/2006/main" xmlns:w14="http://schemas.microsoft.com/office/word/2010/wordml" xmlns:w15="http://schemas.microsoft.com/office/word/2012/wordml" xmlns:w16cex="http://schemas.microsoft.com/office/word/2018/wordml/cex" xmlns:w16cid="http://schemas.microsoft.com/office/word/2016/wordml/cid" xmlns:w16="http://schemas.microsoft.com/office/word/2018/wordml" xmlns:w16du="http://schemas.microsoft.com/office/word/2023/wordml/word16du" xmlns:w16sdtdh="http://schemas.microsoft.com/office/word/2020/wordml/sdtdatahash" xmlns:w16sdtfl="http://schemas.microsoft.com/office/word/2024/wordml/sdtformatlock" xmlns:w16se="http://schemas.microsoft.com/office/word/2015/wordml/symex" xmlns:wpg="http://schemas.microsoft.com/office/word/2010/wordprocessingGroup" xmlns:wpi="http://schemas.microsoft.com/office/word/2010/wordprocessingInk" xmlns:wne="http://schemas.microsoft.com/office/word/2006/wordml" xmlns:wps="http://schemas.microsoft.com/office/word/2010/wordprocessingShape" mc:Ignorable="w14 w15 w16se w16cid w16 w16cex w16sdtdh w16sdtfl w16du wp14">
+<w:document xmlns:wpc="http://schemas.microsoft.com/office/word/2010/wordprocessingCanvas" xmlns:cx="http://schemas.microsoft.com/office/drawing/2014/chartex" xmlns:cx1="http://schemas.microsoft.com/office/drawing/2015/9/8/chartex" xmlns:cx2="http://schemas.microsoft.com/office/drawing/2015/10/21/chartex" xmlns:cx3="http://schemas.microsoft.com/office/drawing/2016/5/9/chartex" xmlns:cx4="http://schemas.microsoft.com/office/drawing/2016/5/10/chartex" xmlns:cx5="http://schemas.microsoft.com/office/drawing/2016/5/11/chartex" xmlns:cx6="http://schemas.microsoft.com/office/drawing/2016/5/12/chartex" xmlns:cx7="http://schemas.microsoft.com/office/drawing/2016/5/13/chartex" xmlns:cx8="http://schemas.microsoft.com/office/drawing/2016/5/14/chartex" xmlns:mc="http://schemas.openxmlformats.org/markup-compatibility/2006" xmlns:aink="http://schemas.microsoft.com/office/drawing/2016/ink" xmlns:am3d="http://schemas.microsoft.com/office/drawing/2017/model3d" xmlns:o="urn:schemas-microsoft-com:office:office" xmlns:oel="http://schemas.microsoft.com/office/2019/extlst" xmlns:r="http://schemas.openxmlformats.org/officeDocument/2006/relationships" xmlns:m="http://schemas.openxmlformats.org/officeDocument/2006/math" xmlns:v="urn:schemas-microsoft-com:vml" xmlns:wp14="http://schemas.microsoft.com/office/word/2010/wordprocessingDrawing" xmlns:wp="http://schemas.openxmlformats.org/drawingml/2006/wordprocessingDrawing" xmlns:w10="urn:schemas-microsoft-com:office:word" xmlns:w="http://schemas.openxmlformats.org/wordprocessingml/2006/main" xmlns:w14="http://schemas.microsoft.com/office/word/2010/wordml" xmlns:w15="http://schemas.microsoft.com/office/word/2012/wordml" xmlns:w16cei="http://schemas.microsoft.com/office/word/2026/wordml/cei" xmlns:w16cex="http://schemas.microsoft.com/office/word/2018/wordml/cex" xmlns:w16cid="http://schemas.microsoft.com/office/word/2016/wordml/cid" xmlns:w16="http://schemas.microsoft.com/office/word/2018/wordml" xmlns:w16du="http://schemas.microsoft.com/office/word/2023/wordml/word16du" xmlns:w16sdtdh="http://schemas.microsoft.com/office/word/2020/wordml/sdtdatahash" xmlns:w16sdtfl="http://schemas.microsoft.com/office/word/2024/wordml/sdtformatlock" xmlns:w16se="http://schemas.microsoft.com/office/word/2015/wordml/symex" xmlns:wpg="http://schemas.microsoft.com/office/word/2010/wordprocessingGroup" xmlns:wpi="http://schemas.microsoft.com/office/word/2010/wordprocessingInk" xmlns:wne="http://schemas.microsoft.com/office/word/2006/wordml" xmlns:wps="http://schemas.microsoft.com/office/word/2010/wordprocessingShape" mc:Ignorable="w14 w15 w16se w16cid w16 w16cex w16sdtdh w16sdtfl w16du wp14">
   <w:body>
     <w:p>
       <w:pPr>
@@ -36,13 +36,8 @@
       </w:r>
     </w:p>
     <w:p>
-      <w:proofErr w:type="spellStart"/>
-      <w:r>
-        <w:t>Thakasa</w:t>
-      </w:r>
-      <w:proofErr w:type="spellEnd"/>
-      <w:r>
-        <w:t xml:space="preserve"> Ngcobo: u25556526</w:t>
+      <w:r>
+        <w:t>Thakasa Ngcobo: u25556526</w:t>
       </w:r>
     </w:p>
     <w:p>
@@ -85,13 +80,8 @@
       </w:r>
     </w:p>
     <w:p>
-      <w:proofErr w:type="spellStart"/>
-      <w:r>
-        <w:t>TaskForge</w:t>
-      </w:r>
-      <w:proofErr w:type="spellEnd"/>
-      <w:r>
-        <w:t xml:space="preserve"> is applied to automotive manufacturing: a factory processes Production</w:t>
+      <w:r>
+        <w:t>TaskForge is applied to automotive manufacturing: a factory processes Production</w:t>
       </w:r>
       <w:r>
         <w:t xml:space="preserve"> </w:t>
@@ -162,7 +152,6 @@
           <w:u w:val="single"/>
         </w:rPr>
       </w:pPr>
-      <w:proofErr w:type="spellStart"/>
       <w:r>
         <w:rPr>
           <w:b/>
@@ -171,18 +160,7 @@
           <w:szCs w:val="28"/>
           <w:u w:val="single"/>
         </w:rPr>
-        <w:t>GoF</w:t>
-      </w:r>
-      <w:proofErr w:type="spellEnd"/>
-      <w:r>
-        <w:rPr>
-          <w:b/>
-          <w:bCs/>
-          <w:sz w:val="28"/>
-          <w:szCs w:val="28"/>
-          <w:u w:val="single"/>
-        </w:rPr>
-        <w:t xml:space="preserve"> participants:</w:t>
+        <w:t>GoF participants:</w:t>
       </w:r>
     </w:p>
     <w:p>
@@ -231,15 +209,7 @@
         <w:t xml:space="preserve">: </w:t>
       </w:r>
       <w:r>
-        <w:t xml:space="preserve"> </w:t>
-      </w:r>
-      <w:proofErr w:type="spellStart"/>
-      <w:r>
-        <w:t>WorkComponent</w:t>
-      </w:r>
-      <w:proofErr w:type="spellEnd"/>
-      <w:r>
-        <w:t xml:space="preserve"> (Abstract class)</w:t>
+        <w:t xml:space="preserve"> WorkComponent (Abstract class)</w:t>
       </w:r>
     </w:p>
     <w:p>
@@ -267,74 +237,16 @@
         <w:t xml:space="preserve">: </w:t>
       </w:r>
       <w:r>
-        <w:t xml:space="preserve"> </w:t>
-      </w:r>
-      <w:proofErr w:type="spellStart"/>
-      <w:r>
-        <w:t>SubAssembly</w:t>
-      </w:r>
-      <w:proofErr w:type="spellEnd"/>
-      <w:r>
-        <w:t xml:space="preserve"> </w:t>
-      </w:r>
-      <w:r>
-        <w:t>and its subclasses (</w:t>
-      </w:r>
-      <w:proofErr w:type="spellStart"/>
-      <w:r>
-        <w:t>ProductionOrder</w:t>
-      </w:r>
-      <w:proofErr w:type="spellEnd"/>
-      <w:r>
-        <w:t xml:space="preserve">, </w:t>
-      </w:r>
-      <w:proofErr w:type="spellStart"/>
-      <w:r>
-        <w:t>MechanicalAssembly</w:t>
-      </w:r>
-      <w:proofErr w:type="spellEnd"/>
-      <w:r>
-        <w:t xml:space="preserve">, </w:t>
-      </w:r>
-      <w:proofErr w:type="spellStart"/>
-      <w:r>
-        <w:t>ElectricalAssembly</w:t>
-      </w:r>
-      <w:proofErr w:type="spellEnd"/>
-      <w:r>
-        <w:t xml:space="preserve">, </w:t>
-      </w:r>
-      <w:proofErr w:type="spellStart"/>
-      <w:r>
-        <w:t>PaintAndFinishAssembly</w:t>
-      </w:r>
-      <w:proofErr w:type="spellEnd"/>
-      <w:r>
-        <w:t xml:space="preserve">, </w:t>
-      </w:r>
-      <w:proofErr w:type="spellStart"/>
-      <w:r>
-        <w:t>FrameSubGroup</w:t>
-      </w:r>
-      <w:proofErr w:type="spellEnd"/>
-      <w:r>
-        <w:t xml:space="preserve">, </w:t>
-      </w:r>
-      <w:proofErr w:type="spellStart"/>
-      <w:r>
-        <w:t>SuspensionSubGroup</w:t>
-      </w:r>
-      <w:proofErr w:type="spellEnd"/>
-      <w:r>
-        <w:t xml:space="preserve">, </w:t>
-      </w:r>
-      <w:proofErr w:type="spellStart"/>
-      <w:r>
-        <w:t>FinishingSubGroup</w:t>
-      </w:r>
-      <w:proofErr w:type="spellEnd"/>
-      <w:r>
-        <w:t>)</w:t>
+        <w:t xml:space="preserve"> SubAssembly </w:t>
+      </w:r>
+      <w:r>
+        <w:t xml:space="preserve">and its subclasses (ProductionOrder, </w:t>
+      </w:r>
+      <w:r>
+        <w:t xml:space="preserve">MechanicalAssembly, ElectricalAssembly, PaintAndFinishAssembly, FrameSubGroup, SuspensionSubGroup, </w:t>
+      </w:r>
+      <w:r>
+        <w:t>FinishingSubGroup)</w:t>
       </w:r>
     </w:p>
     <w:p>
@@ -364,37 +276,8 @@
       <w:r>
         <w:t xml:space="preserve"> Operation and its subclasses (</w:t>
       </w:r>
-      <w:proofErr w:type="spellStart"/>
-      <w:r>
-        <w:t>WeldingOperation</w:t>
-      </w:r>
-      <w:proofErr w:type="spellEnd"/>
-      <w:r>
-        <w:t xml:space="preserve">, </w:t>
-      </w:r>
-      <w:proofErr w:type="spellStart"/>
-      <w:r>
-        <w:t>InspectionOperation</w:t>
-      </w:r>
-      <w:proofErr w:type="spellEnd"/>
-      <w:r>
-        <w:t xml:space="preserve">, </w:t>
-      </w:r>
-      <w:proofErr w:type="spellStart"/>
-      <w:r>
-        <w:t>AssemblyOperation</w:t>
-      </w:r>
-      <w:proofErr w:type="spellEnd"/>
-      <w:r>
-        <w:t xml:space="preserve">, </w:t>
-      </w:r>
-      <w:proofErr w:type="spellStart"/>
-      <w:r>
-        <w:t>PaintingOperation</w:t>
-      </w:r>
-      <w:proofErr w:type="spellEnd"/>
-      <w:r>
-        <w:t>)</w:t>
+      <w:r>
+        <w:t>WeldingOperation, InspectionOperation, AssemblyOperation, PaintingOperation)</w:t>
       </w:r>
     </w:p>
     <w:p>
@@ -449,11 +332,9 @@
       <w:r>
         <w:t xml:space="preserve"> </w:t>
       </w:r>
-      <w:proofErr w:type="spellStart"/>
       <w:r>
         <w:t>WorkComponent</w:t>
       </w:r>
-      <w:proofErr w:type="spellEnd"/>
     </w:p>
     <w:p>
       <w:pPr>
@@ -467,7 +348,6 @@
           <w:bCs/>
         </w:rPr>
       </w:pPr>
-      <w:proofErr w:type="spellStart"/>
       <w:r>
         <w:rPr>
           <w:i/>
@@ -475,33 +355,19 @@
           <w:u w:val="single"/>
         </w:rPr>
         <w:lastRenderedPageBreak/>
-        <w:t>ConcreteComponent</w:t>
-      </w:r>
-      <w:proofErr w:type="spellEnd"/>
+        <w:t>ConcreteComponent:</w:t>
+      </w:r>
       <w:r>
         <w:rPr>
           <w:i/>
           <w:iCs/>
           <w:u w:val="single"/>
         </w:rPr>
-        <w:t>:</w:t>
-      </w:r>
-      <w:r>
-        <w:rPr>
-          <w:i/>
-          <w:iCs/>
-          <w:u w:val="single"/>
-        </w:rPr>
         <w:t xml:space="preserve"> </w:t>
       </w:r>
       <w:r>
-        <w:t xml:space="preserve">Operation, </w:t>
-      </w:r>
-      <w:proofErr w:type="spellStart"/>
-      <w:r>
-        <w:t>SubAssembly</w:t>
-      </w:r>
-      <w:proofErr w:type="spellEnd"/>
+        <w:t>Operation, SubAssembly</w:t>
+      </w:r>
     </w:p>
     <w:p>
       <w:pPr>
@@ -547,37 +413,17 @@
           <w:bCs/>
         </w:rPr>
       </w:pPr>
-      <w:proofErr w:type="spellStart"/>
       <w:r>
         <w:rPr>
           <w:i/>
           <w:iCs/>
           <w:u w:val="single"/>
         </w:rPr>
-        <w:t>ConcreteDecorator</w:t>
-      </w:r>
-      <w:proofErr w:type="spellEnd"/>
-      <w:r>
-        <w:rPr>
-          <w:i/>
-          <w:iCs/>
-          <w:u w:val="single"/>
-        </w:rPr>
-        <w:t xml:space="preserve">: </w:t>
-      </w:r>
-      <w:proofErr w:type="spellStart"/>
-      <w:r>
-        <w:t>PriorityDecorator</w:t>
-      </w:r>
-      <w:proofErr w:type="spellEnd"/>
-      <w:r>
-        <w:t xml:space="preserve">, </w:t>
-      </w:r>
-      <w:proofErr w:type="spellStart"/>
-      <w:r>
-        <w:t>FragileDecorator</w:t>
-      </w:r>
-      <w:proofErr w:type="spellEnd"/>
+        <w:t xml:space="preserve">ConcreteDecorator: </w:t>
+      </w:r>
+      <w:r>
+        <w:t>PriorityDecorator, FragileDecorator</w:t>
+      </w:r>
     </w:p>
     <w:p>
       <w:pPr>
@@ -640,23 +486,13 @@
           <w:bCs/>
         </w:rPr>
       </w:pPr>
-      <w:proofErr w:type="spellStart"/>
       <w:r>
         <w:rPr>
           <w:i/>
           <w:iCs/>
           <w:u w:val="single"/>
         </w:rPr>
-        <w:t>ConcreteIterator</w:t>
-      </w:r>
-      <w:proofErr w:type="spellEnd"/>
-      <w:r>
-        <w:rPr>
-          <w:i/>
-          <w:iCs/>
-          <w:u w:val="single"/>
-        </w:rPr>
-        <w:t xml:space="preserve">: </w:t>
+        <w:t xml:space="preserve">ConcreteIterator: </w:t>
       </w:r>
     </w:p>
     <w:p>
@@ -692,23 +528,13 @@
           <w:bCs/>
         </w:rPr>
       </w:pPr>
-      <w:proofErr w:type="spellStart"/>
       <w:r>
         <w:rPr>
           <w:i/>
           <w:iCs/>
           <w:u w:val="single"/>
         </w:rPr>
-        <w:t>ConcreteAggregate</w:t>
-      </w:r>
-      <w:proofErr w:type="spellEnd"/>
-      <w:r>
-        <w:rPr>
-          <w:i/>
-          <w:iCs/>
-          <w:u w:val="single"/>
-        </w:rPr>
-        <w:t>:</w:t>
+        <w:t>ConcreteAggregate:</w:t>
       </w:r>
     </w:p>
     <w:p>
@@ -772,23 +598,13 @@
           <w:bCs/>
         </w:rPr>
       </w:pPr>
-      <w:proofErr w:type="spellStart"/>
       <w:r>
         <w:rPr>
           <w:i/>
           <w:iCs/>
           <w:u w:val="single"/>
         </w:rPr>
-        <w:t>ConcreteState</w:t>
-      </w:r>
-      <w:proofErr w:type="spellEnd"/>
-      <w:r>
-        <w:rPr>
-          <w:i/>
-          <w:iCs/>
-          <w:u w:val="single"/>
-        </w:rPr>
-        <w:t>:</w:t>
+        <w:t>ConcreteState:</w:t>
       </w:r>
     </w:p>
     <w:p>
@@ -866,19 +682,12 @@
           <w:numId w:val="3"/>
         </w:numPr>
       </w:pPr>
-      <w:proofErr w:type="spellStart"/>
-      <w:r>
-        <w:t>SubAssembly</w:t>
-      </w:r>
-      <w:proofErr w:type="spellEnd"/>
-      <w:r>
-        <w:t xml:space="preserve"> and operation inherit from </w:t>
-      </w:r>
-      <w:proofErr w:type="spellStart"/>
+      <w:r>
+        <w:t xml:space="preserve">SubAssembly and operation inherit from </w:t>
+      </w:r>
       <w:r>
         <w:t>WorkComponent</w:t>
       </w:r>
-      <w:proofErr w:type="spellEnd"/>
     </w:p>
     <w:p/>
     <w:p>
@@ -906,13 +715,8 @@
           <w:numId w:val="3"/>
         </w:numPr>
       </w:pPr>
-      <w:proofErr w:type="spellStart"/>
-      <w:r>
-        <w:t>SubAssembly</w:t>
-      </w:r>
-      <w:proofErr w:type="spellEnd"/>
-      <w:r>
-        <w:t xml:space="preserve"> </w:t>
+      <w:r>
+        <w:t xml:space="preserve">SubAssembly </w:t>
       </w:r>
       <w:r>
         <w:rPr>
@@ -922,15 +726,7 @@
         <w:t>has-a</w:t>
       </w:r>
       <w:r>
-        <w:t xml:space="preserve"> collection of </w:t>
-      </w:r>
-      <w:proofErr w:type="spellStart"/>
-      <w:r>
-        <w:t>WorkComponent’s</w:t>
-      </w:r>
-      <w:proofErr w:type="spellEnd"/>
-      <w:r>
-        <w:t xml:space="preserve"> </w:t>
+        <w:t xml:space="preserve"> collection of WorkComponent’s </w:t>
       </w:r>
     </w:p>
     <w:p/>
@@ -960,15 +756,7 @@
         </w:numPr>
       </w:pPr>
       <w:r>
-        <w:t xml:space="preserve">One </w:t>
-      </w:r>
-      <w:proofErr w:type="spellStart"/>
-      <w:r>
-        <w:t>SubAssembly</w:t>
-      </w:r>
-      <w:proofErr w:type="spellEnd"/>
-      <w:r>
-        <w:t xml:space="preserve"> to</w:t>
+        <w:t>One SubAssembly to</w:t>
       </w:r>
       <w:r>
         <w:t xml:space="preserve"> </w:t>
@@ -981,15 +769,7 @@
         <w:t>0..*</w:t>
       </w:r>
       <w:r>
-        <w:t xml:space="preserve"> </w:t>
-      </w:r>
-      <w:proofErr w:type="spellStart"/>
-      <w:r>
-        <w:t>WorkComponent</w:t>
-      </w:r>
-      <w:proofErr w:type="spellEnd"/>
-      <w:r>
-        <w:t xml:space="preserve"> children</w:t>
+        <w:t xml:space="preserve"> WorkComponent children</w:t>
       </w:r>
     </w:p>
     <w:p/>
@@ -1018,13 +798,8 @@
           <w:numId w:val="3"/>
         </w:numPr>
       </w:pPr>
-      <w:proofErr w:type="spellStart"/>
-      <w:r>
-        <w:t>SubAssembly</w:t>
-      </w:r>
-      <w:proofErr w:type="spellEnd"/>
-      <w:r>
-        <w:t xml:space="preserve"> owns its children and is responsible for their deletion</w:t>
+      <w:r>
+        <w:t>SubAssembly owns its children and is responsible for their deletion</w:t>
       </w:r>
     </w:p>
     <w:p>
@@ -1115,13 +890,8 @@
     </w:p>
     <w:p>
       <w:r>
-        <w:t xml:space="preserve">Iterator only applies to the </w:t>
-      </w:r>
-      <w:proofErr w:type="spellStart"/>
-      <w:r>
-        <w:t>SubAssembly</w:t>
-      </w:r>
-      <w:proofErr w:type="spellEnd"/>
+        <w:t>Iterator only applies to the SubAssembly</w:t>
+      </w:r>
       <w:r>
         <w:t xml:space="preserve"> (composite), as there is no point in it iterating over a leaf.</w:t>
       </w:r>
@@ -1152,7 +922,7 @@
 </file>
 
 <file path=word/numbering.xml><?xml version="1.0" encoding="utf-8"?>
-<w:numbering xmlns:wpc="http://schemas.microsoft.com/office/word/2010/wordprocessingCanvas" xmlns:cx="http://schemas.microsoft.com/office/drawing/2014/chartex" xmlns:cx1="http://schemas.microsoft.com/office/drawing/2015/9/8/chartex" xmlns:cx2="http://schemas.microsoft.com/office/drawing/2015/10/21/chartex" xmlns:cx3="http://schemas.microsoft.com/office/drawing/2016/5/9/chartex" xmlns:cx4="http://schemas.microsoft.com/office/drawing/2016/5/10/chartex" xmlns:cx5="http://schemas.microsoft.com/office/drawing/2016/5/11/chartex" xmlns:cx6="http://schemas.microsoft.com/office/drawing/2016/5/12/chartex" xmlns:cx7="http://schemas.microsoft.com/office/drawing/2016/5/13/chartex" xmlns:cx8="http://schemas.microsoft.com/office/drawing/2016/5/14/chartex" xmlns:mc="http://schemas.openxmlformats.org/markup-compatibility/2006" xmlns:aink="http://schemas.microsoft.com/office/drawing/2016/ink" xmlns:am3d="http://schemas.microsoft.com/office/drawing/2017/model3d" xmlns:o="urn:schemas-microsoft-com:office:office" xmlns:oel="http://schemas.microsoft.com/office/2019/extlst" xmlns:r="http://schemas.openxmlformats.org/officeDocument/2006/relationships" xmlns:m="http://schemas.openxmlformats.org/officeDocument/2006/math" xmlns:v="urn:schemas-microsoft-com:vml" xmlns:wp14="http://schemas.microsoft.com/office/word/2010/wordprocessingDrawing" xmlns:wp="http://schemas.openxmlformats.org/drawingml/2006/wordprocessingDrawing" xmlns:w10="urn:schemas-microsoft-com:office:word" xmlns:w="http://schemas.openxmlformats.org/wordprocessingml/2006/main" xmlns:w14="http://schemas.microsoft.com/office/word/2010/wordml" xmlns:w15="http://schemas.microsoft.com/office/word/2012/wordml" xmlns:w16cex="http://schemas.microsoft.com/office/word/2018/wordml/cex" xmlns:w16cid="http://schemas.microsoft.com/office/word/2016/wordml/cid" xmlns:w16="http://schemas.microsoft.com/office/word/2018/wordml" xmlns:w16du="http://schemas.microsoft.com/office/word/2023/wordml/word16du" xmlns:w16sdtdh="http://schemas.microsoft.com/office/word/2020/wordml/sdtdatahash" xmlns:w16sdtfl="http://schemas.microsoft.com/office/word/2024/wordml/sdtformatlock" xmlns:w16se="http://schemas.microsoft.com/office/word/2015/wordml/symex" xmlns:wpg="http://schemas.microsoft.com/office/word/2010/wordprocessingGroup" xmlns:wpi="http://schemas.microsoft.com/office/word/2010/wordprocessingInk" xmlns:wne="http://schemas.microsoft.com/office/word/2006/wordml" xmlns:wps="http://schemas.microsoft.com/office/word/2010/wordprocessingShape" mc:Ignorable="w14 w15 w16se w16cid w16 w16cex w16sdtdh w16sdtfl w16du wp14">
+<w:numbering xmlns:wpc="http://schemas.microsoft.com/office/word/2010/wordprocessingCanvas" xmlns:cx="http://schemas.microsoft.com/office/drawing/2014/chartex" xmlns:cx1="http://schemas.microsoft.com/office/drawing/2015/9/8/chartex" xmlns:cx2="http://schemas.microsoft.com/office/drawing/2015/10/21/chartex" xmlns:cx3="http://schemas.microsoft.com/office/drawing/2016/5/9/chartex" xmlns:cx4="http://schemas.microsoft.com/office/drawing/2016/5/10/chartex" xmlns:cx5="http://schemas.microsoft.com/office/drawing/2016/5/11/chartex" xmlns:cx6="http://schemas.microsoft.com/office/drawing/2016/5/12/chartex" xmlns:cx7="http://schemas.microsoft.com/office/drawing/2016/5/13/chartex" xmlns:cx8="http://schemas.microsoft.com/office/drawing/2016/5/14/chartex" xmlns:mc="http://schemas.openxmlformats.org/markup-compatibility/2006" xmlns:aink="http://schemas.microsoft.com/office/drawing/2016/ink" xmlns:am3d="http://schemas.microsoft.com/office/drawing/2017/model3d" xmlns:o="urn:schemas-microsoft-com:office:office" xmlns:oel="http://schemas.microsoft.com/office/2019/extlst" xmlns:r="http://schemas.openxmlformats.org/officeDocument/2006/relationships" xmlns:m="http://schemas.openxmlformats.org/officeDocument/2006/math" xmlns:v="urn:schemas-microsoft-com:vml" xmlns:wp14="http://schemas.microsoft.com/office/word/2010/wordprocessingDrawing" xmlns:wp="http://schemas.openxmlformats.org/drawingml/2006/wordprocessingDrawing" xmlns:w10="urn:schemas-microsoft-com:office:word" xmlns:w="http://schemas.openxmlformats.org/wordprocessingml/2006/main" xmlns:w14="http://schemas.microsoft.com/office/word/2010/wordml" xmlns:w15="http://schemas.microsoft.com/office/word/2012/wordml" xmlns:w16cei="http://schemas.microsoft.com/office/word/2026/wordml/cei" xmlns:w16cex="http://schemas.microsoft.com/office/word/2018/wordml/cex" xmlns:w16cid="http://schemas.microsoft.com/office/word/2016/wordml/cid" xmlns:w16="http://schemas.microsoft.com/office/word/2018/wordml" xmlns:w16du="http://schemas.microsoft.com/office/word/2023/wordml/word16du" xmlns:w16sdtdh="http://schemas.microsoft.com/office/word/2020/wordml/sdtdatahash" xmlns:w16sdtfl="http://schemas.microsoft.com/office/word/2024/wordml/sdtformatlock" xmlns:w16se="http://schemas.microsoft.com/office/word/2015/wordml/symex" xmlns:wpg="http://schemas.microsoft.com/office/word/2010/wordprocessingGroup" xmlns:wpi="http://schemas.microsoft.com/office/word/2010/wordprocessingInk" xmlns:wne="http://schemas.microsoft.com/office/word/2006/wordml" xmlns:wps="http://schemas.microsoft.com/office/word/2010/wordprocessingShape" mc:Ignorable="w14 w15 w16se w16cid w16 w16cex w16sdtdh w16sdtfl w16du wp14">
   <w:abstractNum w:abstractNumId="0" w15:restartNumberingAfterBreak="0">
     <w:nsid w:val="1B362117"/>
     <w:multiLevelType w:val="hybridMultilevel"/>

</xml_diff>

<commit_message>
Update pdf with object diagram.
</commit_message>
<xml_diff>
--- a/Prac4.docx
+++ b/Prac4.docx
@@ -1,6 +1,6 @@
 
 <file path=word/document.xml><?xml version="1.0" encoding="utf-8"?>
-<w:document xmlns:wpc="http://schemas.microsoft.com/office/word/2010/wordprocessingCanvas" xmlns:cx="http://schemas.microsoft.com/office/drawing/2014/chartex" xmlns:cx1="http://schemas.microsoft.com/office/drawing/2015/9/8/chartex" xmlns:cx2="http://schemas.microsoft.com/office/drawing/2015/10/21/chartex" xmlns:cx3="http://schemas.microsoft.com/office/drawing/2016/5/9/chartex" xmlns:cx4="http://schemas.microsoft.com/office/drawing/2016/5/10/chartex" xmlns:cx5="http://schemas.microsoft.com/office/drawing/2016/5/11/chartex" xmlns:cx6="http://schemas.microsoft.com/office/drawing/2016/5/12/chartex" xmlns:cx7="http://schemas.microsoft.com/office/drawing/2016/5/13/chartex" xmlns:cx8="http://schemas.microsoft.com/office/drawing/2016/5/14/chartex" xmlns:mc="http://schemas.openxmlformats.org/markup-compatibility/2006" xmlns:aink="http://schemas.microsoft.com/office/drawing/2016/ink" xmlns:am3d="http://schemas.microsoft.com/office/drawing/2017/model3d" xmlns:o="urn:schemas-microsoft-com:office:office" xmlns:oel="http://schemas.microsoft.com/office/2019/extlst" xmlns:r="http://schemas.openxmlformats.org/officeDocument/2006/relationships" xmlns:m="http://schemas.openxmlformats.org/officeDocument/2006/math" xmlns:v="urn:schemas-microsoft-com:vml" xmlns:wp14="http://schemas.microsoft.com/office/word/2010/wordprocessingDrawing" xmlns:wp="http://schemas.openxmlformats.org/drawingml/2006/wordprocessingDrawing" xmlns:w10="urn:schemas-microsoft-com:office:word" xmlns:w="http://schemas.openxmlformats.org/wordprocessingml/2006/main" xmlns:w14="http://schemas.microsoft.com/office/word/2010/wordml" xmlns:w15="http://schemas.microsoft.com/office/word/2012/wordml" xmlns:w16cex="http://schemas.microsoft.com/office/word/2018/wordml/cex" xmlns:w16cid="http://schemas.microsoft.com/office/word/2016/wordml/cid" xmlns:w16="http://schemas.microsoft.com/office/word/2018/wordml" xmlns:w16du="http://schemas.microsoft.com/office/word/2023/wordml/word16du" xmlns:w16sdtdh="http://schemas.microsoft.com/office/word/2020/wordml/sdtdatahash" xmlns:w16sdtfl="http://schemas.microsoft.com/office/word/2024/wordml/sdtformatlock" xmlns:w16se="http://schemas.microsoft.com/office/word/2015/wordml/symex" xmlns:wpg="http://schemas.microsoft.com/office/word/2010/wordprocessingGroup" xmlns:wpi="http://schemas.microsoft.com/office/word/2010/wordprocessingInk" xmlns:wne="http://schemas.microsoft.com/office/word/2006/wordml" xmlns:wps="http://schemas.microsoft.com/office/word/2010/wordprocessingShape" mc:Ignorable="w14 w15 w16se w16cid w16 w16cex w16sdtdh w16sdtfl w16du wp14">
+<w:document xmlns:wpc="http://schemas.microsoft.com/office/word/2010/wordprocessingCanvas" xmlns:cx="http://schemas.microsoft.com/office/drawing/2014/chartex" xmlns:cx1="http://schemas.microsoft.com/office/drawing/2015/9/8/chartex" xmlns:cx2="http://schemas.microsoft.com/office/drawing/2015/10/21/chartex" xmlns:cx3="http://schemas.microsoft.com/office/drawing/2016/5/9/chartex" xmlns:cx4="http://schemas.microsoft.com/office/drawing/2016/5/10/chartex" xmlns:cx5="http://schemas.microsoft.com/office/drawing/2016/5/11/chartex" xmlns:cx6="http://schemas.microsoft.com/office/drawing/2016/5/12/chartex" xmlns:cx7="http://schemas.microsoft.com/office/drawing/2016/5/13/chartex" xmlns:cx8="http://schemas.microsoft.com/office/drawing/2016/5/14/chartex" xmlns:mc="http://schemas.openxmlformats.org/markup-compatibility/2006" xmlns:aink="http://schemas.microsoft.com/office/drawing/2016/ink" xmlns:am3d="http://schemas.microsoft.com/office/drawing/2017/model3d" xmlns:o="urn:schemas-microsoft-com:office:office" xmlns:oel="http://schemas.microsoft.com/office/2019/extlst" xmlns:r="http://schemas.openxmlformats.org/officeDocument/2006/relationships" xmlns:m="http://schemas.openxmlformats.org/officeDocument/2006/math" xmlns:v="urn:schemas-microsoft-com:vml" xmlns:wp14="http://schemas.microsoft.com/office/word/2010/wordprocessingDrawing" xmlns:wp="http://schemas.openxmlformats.org/drawingml/2006/wordprocessingDrawing" xmlns:w10="urn:schemas-microsoft-com:office:word" xmlns:w="http://schemas.openxmlformats.org/wordprocessingml/2006/main" xmlns:w14="http://schemas.microsoft.com/office/word/2010/wordml" xmlns:w15="http://schemas.microsoft.com/office/word/2012/wordml" xmlns:w16cei="http://schemas.microsoft.com/office/word/2026/wordml/cei" xmlns:w16cex="http://schemas.microsoft.com/office/word/2018/wordml/cex" xmlns:w16cid="http://schemas.microsoft.com/office/word/2016/wordml/cid" xmlns:w16="http://schemas.microsoft.com/office/word/2018/wordml" xmlns:w16du="http://schemas.microsoft.com/office/word/2023/wordml/word16du" xmlns:w16sdtdh="http://schemas.microsoft.com/office/word/2020/wordml/sdtdatahash" xmlns:w16sdtfl="http://schemas.microsoft.com/office/word/2024/wordml/sdtformatlock" xmlns:w16se="http://schemas.microsoft.com/office/word/2015/wordml/symex" xmlns:wpg="http://schemas.microsoft.com/office/word/2010/wordprocessingGroup" xmlns:wpi="http://schemas.microsoft.com/office/word/2010/wordprocessingInk" xmlns:wne="http://schemas.microsoft.com/office/word/2006/wordml" xmlns:wps="http://schemas.microsoft.com/office/word/2010/wordprocessingShape" mc:Ignorable="w14 w15 w16se w16cid w16 w16cex w16sdtdh w16sdtfl w16du wp14">
   <w:body>
     <w:p>
       <w:pPr>
@@ -36,13 +36,8 @@
       </w:r>
     </w:p>
     <w:p>
-      <w:proofErr w:type="spellStart"/>
-      <w:r>
-        <w:t>Thakasa</w:t>
-      </w:r>
-      <w:proofErr w:type="spellEnd"/>
-      <w:r>
-        <w:t xml:space="preserve"> Ngcobo: u25556526</w:t>
+      <w:r>
+        <w:t>Thakasa Ngcobo: u25556526</w:t>
       </w:r>
     </w:p>
     <w:p>
@@ -85,13 +80,8 @@
       </w:r>
     </w:p>
     <w:p>
-      <w:proofErr w:type="spellStart"/>
-      <w:r>
-        <w:t>TaskForge</w:t>
-      </w:r>
-      <w:proofErr w:type="spellEnd"/>
-      <w:r>
-        <w:t xml:space="preserve"> is applied to automotive manufacturing: a factory processes Production</w:t>
+      <w:r>
+        <w:t>TaskForge is applied to automotive manufacturing: a factory processes Production</w:t>
       </w:r>
       <w:r>
         <w:t xml:space="preserve"> </w:t>
@@ -148,15 +138,7 @@
     </w:p>
     <w:p>
       <w:r>
-        <w:t>*</w:t>
-      </w:r>
-      <w:proofErr w:type="gramStart"/>
-      <w:r>
-        <w:t>will</w:t>
-      </w:r>
-      <w:proofErr w:type="gramEnd"/>
-      <w:r>
-        <w:t xml:space="preserve"> be done later</w:t>
+        <w:t>*will be done later</w:t>
       </w:r>
     </w:p>
     <w:p/>
@@ -170,7 +152,6 @@
           <w:u w:val="single"/>
         </w:rPr>
       </w:pPr>
-      <w:proofErr w:type="spellStart"/>
       <w:r>
         <w:rPr>
           <w:b/>
@@ -179,18 +160,7 @@
           <w:szCs w:val="28"/>
           <w:u w:val="single"/>
         </w:rPr>
-        <w:t>GoF</w:t>
-      </w:r>
-      <w:proofErr w:type="spellEnd"/>
-      <w:r>
-        <w:rPr>
-          <w:b/>
-          <w:bCs/>
-          <w:sz w:val="28"/>
-          <w:szCs w:val="28"/>
-          <w:u w:val="single"/>
-        </w:rPr>
-        <w:t xml:space="preserve"> participants:</w:t>
+        <w:t>GoF participants:</w:t>
       </w:r>
     </w:p>
     <w:p>
@@ -239,15 +209,7 @@
         <w:t xml:space="preserve">: </w:t>
       </w:r>
       <w:r>
-        <w:t xml:space="preserve"> </w:t>
-      </w:r>
-      <w:proofErr w:type="spellStart"/>
-      <w:r>
-        <w:t>WorkComponent</w:t>
-      </w:r>
-      <w:proofErr w:type="spellEnd"/>
-      <w:r>
-        <w:t xml:space="preserve"> (Abstract class)</w:t>
+        <w:t xml:space="preserve"> WorkComponent (Abstract class)</w:t>
       </w:r>
     </w:p>
     <w:p>
@@ -275,74 +237,16 @@
         <w:t xml:space="preserve">: </w:t>
       </w:r>
       <w:r>
-        <w:t xml:space="preserve"> </w:t>
-      </w:r>
-      <w:proofErr w:type="spellStart"/>
-      <w:r>
-        <w:t>SubAssembly</w:t>
-      </w:r>
-      <w:proofErr w:type="spellEnd"/>
-      <w:r>
-        <w:t xml:space="preserve"> </w:t>
-      </w:r>
-      <w:r>
-        <w:t>and its subclasses (</w:t>
-      </w:r>
-      <w:proofErr w:type="spellStart"/>
-      <w:r>
-        <w:t>ProductionOrder</w:t>
-      </w:r>
-      <w:proofErr w:type="spellEnd"/>
-      <w:r>
-        <w:t xml:space="preserve">, </w:t>
-      </w:r>
-      <w:proofErr w:type="spellStart"/>
-      <w:r>
-        <w:t>MechanicalAssembly</w:t>
-      </w:r>
-      <w:proofErr w:type="spellEnd"/>
-      <w:r>
-        <w:t xml:space="preserve">, </w:t>
-      </w:r>
-      <w:proofErr w:type="spellStart"/>
-      <w:r>
-        <w:t>ElectricalAssembly</w:t>
-      </w:r>
-      <w:proofErr w:type="spellEnd"/>
-      <w:r>
-        <w:t xml:space="preserve">, </w:t>
-      </w:r>
-      <w:proofErr w:type="spellStart"/>
-      <w:r>
-        <w:t>PaintAndFinishAssembly</w:t>
-      </w:r>
-      <w:proofErr w:type="spellEnd"/>
-      <w:r>
-        <w:t xml:space="preserve">, </w:t>
-      </w:r>
-      <w:proofErr w:type="spellStart"/>
-      <w:r>
-        <w:t>FrameSubGroup</w:t>
-      </w:r>
-      <w:proofErr w:type="spellEnd"/>
-      <w:r>
-        <w:t xml:space="preserve">, </w:t>
-      </w:r>
-      <w:proofErr w:type="spellStart"/>
-      <w:r>
-        <w:t>SuspensionSubGroup</w:t>
-      </w:r>
-      <w:proofErr w:type="spellEnd"/>
-      <w:r>
-        <w:t xml:space="preserve">, </w:t>
-      </w:r>
-      <w:proofErr w:type="spellStart"/>
-      <w:r>
-        <w:t>FinishingSubGroup</w:t>
-      </w:r>
-      <w:proofErr w:type="spellEnd"/>
-      <w:r>
-        <w:t>)</w:t>
+        <w:t xml:space="preserve"> SubAssembly </w:t>
+      </w:r>
+      <w:r>
+        <w:t xml:space="preserve">and its subclasses (ProductionOrder, </w:t>
+      </w:r>
+      <w:r>
+        <w:t xml:space="preserve">MechanicalAssembly, ElectricalAssembly, PaintAndFinishAssembly, FrameSubGroup, SuspensionSubGroup, </w:t>
+      </w:r>
+      <w:r>
+        <w:t>FinishingSubGroup)</w:t>
       </w:r>
     </w:p>
     <w:p>
@@ -372,37 +276,8 @@
       <w:r>
         <w:t xml:space="preserve"> Operation and its subclasses (</w:t>
       </w:r>
-      <w:proofErr w:type="spellStart"/>
-      <w:r>
-        <w:t>WeldingOperation</w:t>
-      </w:r>
-      <w:proofErr w:type="spellEnd"/>
-      <w:r>
-        <w:t xml:space="preserve">, </w:t>
-      </w:r>
-      <w:proofErr w:type="spellStart"/>
-      <w:r>
-        <w:t>InspectionOperation</w:t>
-      </w:r>
-      <w:proofErr w:type="spellEnd"/>
-      <w:r>
-        <w:t xml:space="preserve">, </w:t>
-      </w:r>
-      <w:proofErr w:type="spellStart"/>
-      <w:r>
-        <w:t>AssemblyOperation</w:t>
-      </w:r>
-      <w:proofErr w:type="spellEnd"/>
-      <w:r>
-        <w:t xml:space="preserve">, </w:t>
-      </w:r>
-      <w:proofErr w:type="spellStart"/>
-      <w:r>
-        <w:t>PaintingOperation</w:t>
-      </w:r>
-      <w:proofErr w:type="spellEnd"/>
-      <w:r>
-        <w:t>)</w:t>
+      <w:r>
+        <w:t>WeldingOperation, InspectionOperation, AssemblyOperation, PaintingOperation)</w:t>
       </w:r>
     </w:p>
     <w:p>
@@ -457,11 +332,9 @@
       <w:r>
         <w:t xml:space="preserve"> </w:t>
       </w:r>
-      <w:proofErr w:type="spellStart"/>
       <w:r>
         <w:t>WorkComponent</w:t>
       </w:r>
-      <w:proofErr w:type="spellEnd"/>
     </w:p>
     <w:p>
       <w:pPr>
@@ -475,7 +348,6 @@
           <w:bCs/>
         </w:rPr>
       </w:pPr>
-      <w:proofErr w:type="spellStart"/>
       <w:r>
         <w:rPr>
           <w:i/>
@@ -483,33 +355,19 @@
           <w:u w:val="single"/>
         </w:rPr>
         <w:lastRenderedPageBreak/>
-        <w:t>ConcreteComponent</w:t>
-      </w:r>
-      <w:proofErr w:type="spellEnd"/>
+        <w:t>ConcreteComponent:</w:t>
+      </w:r>
       <w:r>
         <w:rPr>
           <w:i/>
           <w:iCs/>
           <w:u w:val="single"/>
         </w:rPr>
-        <w:t>:</w:t>
-      </w:r>
-      <w:r>
-        <w:rPr>
-          <w:i/>
-          <w:iCs/>
-          <w:u w:val="single"/>
-        </w:rPr>
         <w:t xml:space="preserve"> </w:t>
       </w:r>
       <w:r>
-        <w:t xml:space="preserve">Operation, </w:t>
-      </w:r>
-      <w:proofErr w:type="spellStart"/>
-      <w:r>
-        <w:t>SubAssembly</w:t>
-      </w:r>
-      <w:proofErr w:type="spellEnd"/>
+        <w:t>Operation, SubAssembly</w:t>
+      </w:r>
     </w:p>
     <w:p>
       <w:pPr>
@@ -555,37 +413,17 @@
           <w:bCs/>
         </w:rPr>
       </w:pPr>
-      <w:proofErr w:type="spellStart"/>
       <w:r>
         <w:rPr>
           <w:i/>
           <w:iCs/>
           <w:u w:val="single"/>
         </w:rPr>
-        <w:t>ConcreteDecorator</w:t>
-      </w:r>
-      <w:proofErr w:type="spellEnd"/>
-      <w:r>
-        <w:rPr>
-          <w:i/>
-          <w:iCs/>
-          <w:u w:val="single"/>
-        </w:rPr>
-        <w:t xml:space="preserve">: </w:t>
-      </w:r>
-      <w:proofErr w:type="spellStart"/>
-      <w:r>
-        <w:t>PriorityDecorator</w:t>
-      </w:r>
-      <w:proofErr w:type="spellEnd"/>
-      <w:r>
-        <w:t xml:space="preserve">, </w:t>
-      </w:r>
-      <w:proofErr w:type="spellStart"/>
-      <w:r>
-        <w:t>FragileDecorator</w:t>
-      </w:r>
-      <w:proofErr w:type="spellEnd"/>
+        <w:t xml:space="preserve">ConcreteDecorator: </w:t>
+      </w:r>
+      <w:r>
+        <w:t>PriorityDecorator, FragileDecorator</w:t>
+      </w:r>
     </w:p>
     <w:p>
       <w:pPr>
@@ -648,23 +486,13 @@
           <w:bCs/>
         </w:rPr>
       </w:pPr>
-      <w:proofErr w:type="spellStart"/>
       <w:r>
         <w:rPr>
           <w:i/>
           <w:iCs/>
           <w:u w:val="single"/>
         </w:rPr>
-        <w:t>ConcreteIterator</w:t>
-      </w:r>
-      <w:proofErr w:type="spellEnd"/>
-      <w:r>
-        <w:rPr>
-          <w:i/>
-          <w:iCs/>
-          <w:u w:val="single"/>
-        </w:rPr>
-        <w:t xml:space="preserve">: </w:t>
+        <w:t xml:space="preserve">ConcreteIterator: </w:t>
       </w:r>
     </w:p>
     <w:p>
@@ -700,23 +528,13 @@
           <w:bCs/>
         </w:rPr>
       </w:pPr>
-      <w:proofErr w:type="spellStart"/>
       <w:r>
         <w:rPr>
           <w:i/>
           <w:iCs/>
           <w:u w:val="single"/>
         </w:rPr>
-        <w:t>ConcreteAggregate</w:t>
-      </w:r>
-      <w:proofErr w:type="spellEnd"/>
-      <w:r>
-        <w:rPr>
-          <w:i/>
-          <w:iCs/>
-          <w:u w:val="single"/>
-        </w:rPr>
-        <w:t>:</w:t>
+        <w:t>ConcreteAggregate:</w:t>
       </w:r>
     </w:p>
     <w:p>
@@ -780,23 +598,13 @@
           <w:bCs/>
         </w:rPr>
       </w:pPr>
-      <w:proofErr w:type="spellStart"/>
       <w:r>
         <w:rPr>
           <w:i/>
           <w:iCs/>
           <w:u w:val="single"/>
         </w:rPr>
-        <w:t>ConcreteState</w:t>
-      </w:r>
-      <w:proofErr w:type="spellEnd"/>
-      <w:r>
-        <w:rPr>
-          <w:i/>
-          <w:iCs/>
-          <w:u w:val="single"/>
-        </w:rPr>
-        <w:t>:</w:t>
+        <w:t>ConcreteState:</w:t>
       </w:r>
     </w:p>
     <w:p>
@@ -874,19 +682,12 @@
           <w:numId w:val="3"/>
         </w:numPr>
       </w:pPr>
-      <w:proofErr w:type="spellStart"/>
-      <w:r>
-        <w:t>SubAssembly</w:t>
-      </w:r>
-      <w:proofErr w:type="spellEnd"/>
-      <w:r>
-        <w:t xml:space="preserve"> and operation inherit from </w:t>
-      </w:r>
-      <w:proofErr w:type="spellStart"/>
+      <w:r>
+        <w:t xml:space="preserve">SubAssembly and operation inherit from </w:t>
+      </w:r>
       <w:r>
         <w:t>WorkComponent</w:t>
       </w:r>
-      <w:proofErr w:type="spellEnd"/>
     </w:p>
     <w:p/>
     <w:p>
@@ -914,13 +715,8 @@
           <w:numId w:val="3"/>
         </w:numPr>
       </w:pPr>
-      <w:proofErr w:type="spellStart"/>
-      <w:r>
-        <w:t>SubAssembly</w:t>
-      </w:r>
-      <w:proofErr w:type="spellEnd"/>
-      <w:r>
-        <w:t xml:space="preserve"> </w:t>
+      <w:r>
+        <w:t xml:space="preserve">SubAssembly </w:t>
       </w:r>
       <w:r>
         <w:rPr>
@@ -930,15 +726,7 @@
         <w:t>has-a</w:t>
       </w:r>
       <w:r>
-        <w:t xml:space="preserve"> collection of </w:t>
-      </w:r>
-      <w:proofErr w:type="spellStart"/>
-      <w:r>
-        <w:t>WorkComponent’s</w:t>
-      </w:r>
-      <w:proofErr w:type="spellEnd"/>
-      <w:r>
-        <w:t xml:space="preserve"> </w:t>
+        <w:t xml:space="preserve"> collection of WorkComponent’s </w:t>
       </w:r>
     </w:p>
     <w:p/>
@@ -968,45 +756,20 @@
         </w:numPr>
       </w:pPr>
       <w:r>
-        <w:t xml:space="preserve">One </w:t>
-      </w:r>
-      <w:proofErr w:type="spellStart"/>
-      <w:r>
-        <w:t>SubAssembly</w:t>
-      </w:r>
-      <w:proofErr w:type="spellEnd"/>
-      <w:r>
-        <w:t xml:space="preserve"> to</w:t>
+        <w:t>One SubAssembly to</w:t>
       </w:r>
       <w:r>
         <w:t xml:space="preserve"> </w:t>
       </w:r>
-      <w:proofErr w:type="gramStart"/>
       <w:r>
         <w:rPr>
           <w:i/>
           <w:iCs/>
         </w:rPr>
-        <w:t>0..</w:t>
-      </w:r>
-      <w:proofErr w:type="gramEnd"/>
-      <w:r>
-        <w:rPr>
-          <w:i/>
-          <w:iCs/>
-        </w:rPr>
-        <w:t>*</w:t>
-      </w:r>
-      <w:r>
-        <w:t xml:space="preserve"> </w:t>
-      </w:r>
-      <w:proofErr w:type="spellStart"/>
-      <w:r>
-        <w:t>WorkComponent</w:t>
-      </w:r>
-      <w:proofErr w:type="spellEnd"/>
-      <w:r>
-        <w:t xml:space="preserve"> children</w:t>
+        <w:t>0..*</w:t>
+      </w:r>
+      <w:r>
+        <w:t xml:space="preserve"> WorkComponent children</w:t>
       </w:r>
     </w:p>
     <w:p/>
@@ -1035,13 +798,8 @@
           <w:numId w:val="3"/>
         </w:numPr>
       </w:pPr>
-      <w:proofErr w:type="spellStart"/>
-      <w:r>
-        <w:t>SubAssembly</w:t>
-      </w:r>
-      <w:proofErr w:type="spellEnd"/>
-      <w:r>
-        <w:t xml:space="preserve"> owns its children and is responsible for their deletion</w:t>
+      <w:r>
+        <w:t>SubAssembly owns its children and is responsible for their deletion</w:t>
       </w:r>
     </w:p>
     <w:p>
@@ -1097,15 +855,7 @@
     </w:p>
     <w:p>
       <w:r>
-        <w:t xml:space="preserve">The composite owns its children, so when it is deleted </w:t>
-      </w:r>
-      <w:proofErr w:type="gramStart"/>
-      <w:r>
-        <w:t>all of</w:t>
-      </w:r>
-      <w:proofErr w:type="gramEnd"/>
-      <w:r>
-        <w:t xml:space="preserve"> its children are as well.</w:t>
+        <w:t>The composite owns its children, so when it is deleted all of its children are as well.</w:t>
       </w:r>
     </w:p>
     <w:p>
@@ -1116,15 +866,7 @@
         <w:t xml:space="preserve">either be </w:t>
       </w:r>
       <w:r>
-        <w:t xml:space="preserve">made on the </w:t>
-      </w:r>
-      <w:proofErr w:type="gramStart"/>
-      <w:r>
-        <w:t>stack</w:t>
-      </w:r>
-      <w:proofErr w:type="gramEnd"/>
-      <w:r>
-        <w:t xml:space="preserve"> or its deletion/deallocation should be handled by the main/client.</w:t>
+        <w:t>made on the stack or its deletion/deallocation should be handled by the main/client.</w:t>
       </w:r>
     </w:p>
     <w:p>
@@ -1148,13 +890,8 @@
     </w:p>
     <w:p>
       <w:r>
-        <w:t xml:space="preserve">Iterator only applies to the </w:t>
-      </w:r>
-      <w:proofErr w:type="spellStart"/>
-      <w:r>
-        <w:t>SubAssembly</w:t>
-      </w:r>
-      <w:proofErr w:type="spellEnd"/>
+        <w:t>Iterator only applies to the SubAssembly</w:t>
+      </w:r>
       <w:r>
         <w:t xml:space="preserve"> (composite), as there is no point in it iterating over a leaf.</w:t>
       </w:r>
@@ -1214,6 +951,7 @@
         <w:t>:</w:t>
       </w:r>
     </w:p>
+    <w:p/>
     <w:p>
       <w:pPr>
         <w:rPr>
@@ -1232,6 +970,113 @@
           <w:szCs w:val="28"/>
           <w:u w:val="single"/>
         </w:rPr>
+        <w:t>Object Diagram:</w:t>
+      </w:r>
+    </w:p>
+    <w:p>
+      <w:pPr>
+        <w:rPr>
+          <w:b/>
+          <w:bCs/>
+          <w:sz w:val="28"/>
+          <w:szCs w:val="28"/>
+          <w:u w:val="single"/>
+        </w:rPr>
+      </w:pPr>
+      <w:r>
+        <w:rPr>
+          <w:b/>
+          <w:bCs/>
+          <w:noProof/>
+          <w:sz w:val="28"/>
+          <w:szCs w:val="28"/>
+          <w:u w:val="single"/>
+        </w:rPr>
+        <w:drawing>
+          <wp:inline distT="0" distB="0" distL="0" distR="0" wp14:anchorId="6414630C" wp14:editId="2E0CF5BD">
+            <wp:extent cx="5731510" cy="4709795"/>
+            <wp:effectExtent l="0" t="0" r="2540" b="0"/>
+            <wp:docPr id="1832759073" name="Picture 1"/>
+            <wp:cNvGraphicFramePr>
+              <a:graphicFrameLocks xmlns:a="http://schemas.openxmlformats.org/drawingml/2006/main" noChangeAspect="1"/>
+            </wp:cNvGraphicFramePr>
+            <a:graphic xmlns:a="http://schemas.openxmlformats.org/drawingml/2006/main">
+              <a:graphicData uri="http://schemas.openxmlformats.org/drawingml/2006/picture">
+                <pic:pic xmlns:pic="http://schemas.openxmlformats.org/drawingml/2006/picture">
+                  <pic:nvPicPr>
+                    <pic:cNvPr id="1832759073" name=""/>
+                    <pic:cNvPicPr/>
+                  </pic:nvPicPr>
+                  <pic:blipFill>
+                    <a:blip r:embed="rId5"/>
+                    <a:stretch>
+                      <a:fillRect/>
+                    </a:stretch>
+                  </pic:blipFill>
+                  <pic:spPr>
+                    <a:xfrm>
+                      <a:off x="0" y="0"/>
+                      <a:ext cx="5731510" cy="4709795"/>
+                    </a:xfrm>
+                    <a:prstGeom prst="rect">
+                      <a:avLst/>
+                    </a:prstGeom>
+                  </pic:spPr>
+                </pic:pic>
+              </a:graphicData>
+            </a:graphic>
+          </wp:inline>
+        </w:drawing>
+      </w:r>
+    </w:p>
+    <w:p/>
+    <w:p>
+      <w:pPr>
+        <w:rPr>
+          <w:b/>
+          <w:bCs/>
+          <w:sz w:val="28"/>
+          <w:szCs w:val="28"/>
+          <w:u w:val="single"/>
+        </w:rPr>
+      </w:pPr>
+      <w:r>
+        <w:rPr>
+          <w:b/>
+          <w:bCs/>
+          <w:sz w:val="28"/>
+          <w:szCs w:val="28"/>
+          <w:u w:val="single"/>
+        </w:rPr>
+        <w:t>State Diagram:</w:t>
+      </w:r>
+    </w:p>
+    <w:p/>
+    <w:p/>
+    <w:p/>
+    <w:p/>
+    <w:p/>
+    <w:p/>
+    <w:p/>
+    <w:p>
+      <w:pPr>
+        <w:rPr>
+          <w:b/>
+          <w:bCs/>
+          <w:sz w:val="28"/>
+          <w:szCs w:val="28"/>
+          <w:u w:val="single"/>
+        </w:rPr>
+      </w:pPr>
+      <w:r>
+        <w:rPr>
+          <w:b/>
+          <w:bCs/>
+          <w:sz w:val="28"/>
+          <w:szCs w:val="28"/>
+          <w:u w:val="single"/>
+        </w:rPr>
+        <w:lastRenderedPageBreak/>
         <w:t>Action Diagrams:</w:t>
       </w:r>
     </w:p>
@@ -1277,7 +1122,7 @@
                     <pic:cNvPicPr/>
                   </pic:nvPicPr>
                   <pic:blipFill>
-                    <a:blip r:embed="rId5"/>
+                    <a:blip r:embed="rId6"/>
                     <a:stretch>
                       <a:fillRect/>
                     </a:stretch>
@@ -1319,15 +1164,13 @@
         </w:rPr>
         <w:t xml:space="preserve">branching for the checking of how far </w:t>
       </w:r>
-      <w:proofErr w:type="spellStart"/>
       <w:r>
         <w:rPr>
           <w:sz w:val="22"/>
           <w:szCs w:val="28"/>
         </w:rPr>
-        <w:t>a long</w:t>
-      </w:r>
-      <w:proofErr w:type="spellEnd"/>
+        <w:t>along</w:t>
+      </w:r>
       <w:r>
         <w:rPr>
           <w:sz w:val="22"/>
@@ -1363,7 +1206,7 @@
                     <pic:cNvPicPr/>
                   </pic:nvPicPr>
                   <pic:blipFill>
-                    <a:blip r:embed="rId6"/>
+                    <a:blip r:embed="rId7"/>
                     <a:stretch>
                       <a:fillRect/>
                     </a:stretch>
@@ -1397,7 +1240,7 @@
 </file>
 
 <file path=word/numbering.xml><?xml version="1.0" encoding="utf-8"?>
-<w:numbering xmlns:wpc="http://schemas.microsoft.com/office/word/2010/wordprocessingCanvas" xmlns:cx="http://schemas.microsoft.com/office/drawing/2014/chartex" xmlns:cx1="http://schemas.microsoft.com/office/drawing/2015/9/8/chartex" xmlns:cx2="http://schemas.microsoft.com/office/drawing/2015/10/21/chartex" xmlns:cx3="http://schemas.microsoft.com/office/drawing/2016/5/9/chartex" xmlns:cx4="http://schemas.microsoft.com/office/drawing/2016/5/10/chartex" xmlns:cx5="http://schemas.microsoft.com/office/drawing/2016/5/11/chartex" xmlns:cx6="http://schemas.microsoft.com/office/drawing/2016/5/12/chartex" xmlns:cx7="http://schemas.microsoft.com/office/drawing/2016/5/13/chartex" xmlns:cx8="http://schemas.microsoft.com/office/drawing/2016/5/14/chartex" xmlns:mc="http://schemas.openxmlformats.org/markup-compatibility/2006" xmlns:aink="http://schemas.microsoft.com/office/drawing/2016/ink" xmlns:am3d="http://schemas.microsoft.com/office/drawing/2017/model3d" xmlns:o="urn:schemas-microsoft-com:office:office" xmlns:oel="http://schemas.microsoft.com/office/2019/extlst" xmlns:r="http://schemas.openxmlformats.org/officeDocument/2006/relationships" xmlns:m="http://schemas.openxmlformats.org/officeDocument/2006/math" xmlns:v="urn:schemas-microsoft-com:vml" xmlns:wp14="http://schemas.microsoft.com/office/word/2010/wordprocessingDrawing" xmlns:wp="http://schemas.openxmlformats.org/drawingml/2006/wordprocessingDrawing" xmlns:w10="urn:schemas-microsoft-com:office:word" xmlns:w="http://schemas.openxmlformats.org/wordprocessingml/2006/main" xmlns:w14="http://schemas.microsoft.com/office/word/2010/wordml" xmlns:w15="http://schemas.microsoft.com/office/word/2012/wordml" xmlns:w16cex="http://schemas.microsoft.com/office/word/2018/wordml/cex" xmlns:w16cid="http://schemas.microsoft.com/office/word/2016/wordml/cid" xmlns:w16="http://schemas.microsoft.com/office/word/2018/wordml" xmlns:w16du="http://schemas.microsoft.com/office/word/2023/wordml/word16du" xmlns:w16sdtdh="http://schemas.microsoft.com/office/word/2020/wordml/sdtdatahash" xmlns:w16sdtfl="http://schemas.microsoft.com/office/word/2024/wordml/sdtformatlock" xmlns:w16se="http://schemas.microsoft.com/office/word/2015/wordml/symex" xmlns:wpg="http://schemas.microsoft.com/office/word/2010/wordprocessingGroup" xmlns:wpi="http://schemas.microsoft.com/office/word/2010/wordprocessingInk" xmlns:wne="http://schemas.microsoft.com/office/word/2006/wordml" xmlns:wps="http://schemas.microsoft.com/office/word/2010/wordprocessingShape" mc:Ignorable="w14 w15 w16se w16cid w16 w16cex w16sdtdh w16sdtfl w16du wp14">
+<w:numbering xmlns:wpc="http://schemas.microsoft.com/office/word/2010/wordprocessingCanvas" xmlns:cx="http://schemas.microsoft.com/office/drawing/2014/chartex" xmlns:cx1="http://schemas.microsoft.com/office/drawing/2015/9/8/chartex" xmlns:cx2="http://schemas.microsoft.com/office/drawing/2015/10/21/chartex" xmlns:cx3="http://schemas.microsoft.com/office/drawing/2016/5/9/chartex" xmlns:cx4="http://schemas.microsoft.com/office/drawing/2016/5/10/chartex" xmlns:cx5="http://schemas.microsoft.com/office/drawing/2016/5/11/chartex" xmlns:cx6="http://schemas.microsoft.com/office/drawing/2016/5/12/chartex" xmlns:cx7="http://schemas.microsoft.com/office/drawing/2016/5/13/chartex" xmlns:cx8="http://schemas.microsoft.com/office/drawing/2016/5/14/chartex" xmlns:mc="http://schemas.openxmlformats.org/markup-compatibility/2006" xmlns:aink="http://schemas.microsoft.com/office/drawing/2016/ink" xmlns:am3d="http://schemas.microsoft.com/office/drawing/2017/model3d" xmlns:o="urn:schemas-microsoft-com:office:office" xmlns:oel="http://schemas.microsoft.com/office/2019/extlst" xmlns:r="http://schemas.openxmlformats.org/officeDocument/2006/relationships" xmlns:m="http://schemas.openxmlformats.org/officeDocument/2006/math" xmlns:v="urn:schemas-microsoft-com:vml" xmlns:wp14="http://schemas.microsoft.com/office/word/2010/wordprocessingDrawing" xmlns:wp="http://schemas.openxmlformats.org/drawingml/2006/wordprocessingDrawing" xmlns:w10="urn:schemas-microsoft-com:office:word" xmlns:w="http://schemas.openxmlformats.org/wordprocessingml/2006/main" xmlns:w14="http://schemas.microsoft.com/office/word/2010/wordml" xmlns:w15="http://schemas.microsoft.com/office/word/2012/wordml" xmlns:w16cei="http://schemas.microsoft.com/office/word/2026/wordml/cei" xmlns:w16cex="http://schemas.microsoft.com/office/word/2018/wordml/cex" xmlns:w16cid="http://schemas.microsoft.com/office/word/2016/wordml/cid" xmlns:w16="http://schemas.microsoft.com/office/word/2018/wordml" xmlns:w16du="http://schemas.microsoft.com/office/word/2023/wordml/word16du" xmlns:w16sdtdh="http://schemas.microsoft.com/office/word/2020/wordml/sdtdatahash" xmlns:w16sdtfl="http://schemas.microsoft.com/office/word/2024/wordml/sdtformatlock" xmlns:w16se="http://schemas.microsoft.com/office/word/2015/wordml/symex" xmlns:wpg="http://schemas.microsoft.com/office/word/2010/wordprocessingGroup" xmlns:wpi="http://schemas.microsoft.com/office/word/2010/wordprocessingInk" xmlns:wne="http://schemas.microsoft.com/office/word/2006/wordml" xmlns:wps="http://schemas.microsoft.com/office/word/2010/wordprocessingShape" mc:Ignorable="w14 w15 w16se w16cid w16 w16cex w16sdtdh w16sdtfl w16du wp14">
   <w:abstractNum w:abstractNumId="0" w15:restartNumberingAfterBreak="0">
     <w:nsid w:val="1B362117"/>
     <w:multiLevelType w:val="hybridMultilevel"/>

</xml_diff>

<commit_message>
More modifications to pdf, including workflow, commits and adding GitHub repo link.
</commit_message>
<xml_diff>
--- a/Prac4.docx
+++ b/Prac4.docx
@@ -1279,7 +1279,14 @@
         </w:numPr>
       </w:pPr>
       <w:r>
-        <w:t>Sergio: Composite pattern, majority of Task 1, object diagram</w:t>
+        <w:rPr>
+          <w:b/>
+          <w:bCs/>
+        </w:rPr>
+        <w:t>Sergio</w:t>
+      </w:r>
+      <w:r>
+        <w:t>: Composite pattern, majority of Task 1, object diagram</w:t>
       </w:r>
       <w:r>
         <w:t xml:space="preserve">, </w:t>
@@ -1291,6 +1298,88 @@
         <w:t xml:space="preserve">  </w:t>
       </w:r>
     </w:p>
+    <w:p>
+      <w:r>
+        <w:br/>
+      </w:r>
+      <w:r>
+        <w:drawing>
+          <wp:inline distT="0" distB="0" distL="0" distR="0" wp14:anchorId="6C4473C7" wp14:editId="096438F3">
+            <wp:extent cx="5731510" cy="751840"/>
+            <wp:effectExtent l="0" t="0" r="2540" b="0"/>
+            <wp:docPr id="1357554150" name="Picture 1"/>
+            <wp:cNvGraphicFramePr>
+              <a:graphicFrameLocks xmlns:a="http://schemas.openxmlformats.org/drawingml/2006/main" noChangeAspect="1"/>
+            </wp:cNvGraphicFramePr>
+            <a:graphic xmlns:a="http://schemas.openxmlformats.org/drawingml/2006/main">
+              <a:graphicData uri="http://schemas.openxmlformats.org/drawingml/2006/picture">
+                <pic:pic xmlns:pic="http://schemas.openxmlformats.org/drawingml/2006/picture">
+                  <pic:nvPicPr>
+                    <pic:cNvPr id="1357554150" name=""/>
+                    <pic:cNvPicPr/>
+                  </pic:nvPicPr>
+                  <pic:blipFill>
+                    <a:blip r:embed="rId8"/>
+                    <a:stretch>
+                      <a:fillRect/>
+                    </a:stretch>
+                  </pic:blipFill>
+                  <pic:spPr>
+                    <a:xfrm>
+                      <a:off x="0" y="0"/>
+                      <a:ext cx="5731510" cy="751840"/>
+                    </a:xfrm>
+                    <a:prstGeom prst="rect">
+                      <a:avLst/>
+                    </a:prstGeom>
+                  </pic:spPr>
+                </pic:pic>
+              </a:graphicData>
+            </a:graphic>
+          </wp:inline>
+        </w:drawing>
+      </w:r>
+    </w:p>
+    <w:p>
+      <w:r>
+        <w:drawing>
+          <wp:inline distT="0" distB="0" distL="0" distR="0" wp14:anchorId="09D11BA1" wp14:editId="55EB14D6">
+            <wp:extent cx="5731510" cy="764540"/>
+            <wp:effectExtent l="0" t="0" r="2540" b="0"/>
+            <wp:docPr id="1704086166" name="Picture 1"/>
+            <wp:cNvGraphicFramePr>
+              <a:graphicFrameLocks xmlns:a="http://schemas.openxmlformats.org/drawingml/2006/main" noChangeAspect="1"/>
+            </wp:cNvGraphicFramePr>
+            <a:graphic xmlns:a="http://schemas.openxmlformats.org/drawingml/2006/main">
+              <a:graphicData uri="http://schemas.openxmlformats.org/drawingml/2006/picture">
+                <pic:pic xmlns:pic="http://schemas.openxmlformats.org/drawingml/2006/picture">
+                  <pic:nvPicPr>
+                    <pic:cNvPr id="1704086166" name=""/>
+                    <pic:cNvPicPr/>
+                  </pic:nvPicPr>
+                  <pic:blipFill>
+                    <a:blip r:embed="rId9"/>
+                    <a:stretch>
+                      <a:fillRect/>
+                    </a:stretch>
+                  </pic:blipFill>
+                  <pic:spPr>
+                    <a:xfrm>
+                      <a:off x="0" y="0"/>
+                      <a:ext cx="5731510" cy="764540"/>
+                    </a:xfrm>
+                    <a:prstGeom prst="rect">
+                      <a:avLst/>
+                    </a:prstGeom>
+                  </pic:spPr>
+                </pic:pic>
+              </a:graphicData>
+            </a:graphic>
+          </wp:inline>
+        </w:drawing>
+      </w:r>
+    </w:p>
+    <w:p/>
     <w:p>
       <w:pPr>
         <w:pStyle w:val="ListParagraph"/>
@@ -1310,6 +1399,85 @@
       </w:r>
     </w:p>
     <w:p>
+      <w:r>
+        <w:drawing>
+          <wp:inline distT="0" distB="0" distL="0" distR="0" wp14:anchorId="2F86899C" wp14:editId="7635C20A">
+            <wp:extent cx="5731510" cy="771525"/>
+            <wp:effectExtent l="0" t="0" r="2540" b="9525"/>
+            <wp:docPr id="212843838" name="Picture 1"/>
+            <wp:cNvGraphicFramePr>
+              <a:graphicFrameLocks xmlns:a="http://schemas.openxmlformats.org/drawingml/2006/main" noChangeAspect="1"/>
+            </wp:cNvGraphicFramePr>
+            <a:graphic xmlns:a="http://schemas.openxmlformats.org/drawingml/2006/main">
+              <a:graphicData uri="http://schemas.openxmlformats.org/drawingml/2006/picture">
+                <pic:pic xmlns:pic="http://schemas.openxmlformats.org/drawingml/2006/picture">
+                  <pic:nvPicPr>
+                    <pic:cNvPr id="212843838" name=""/>
+                    <pic:cNvPicPr/>
+                  </pic:nvPicPr>
+                  <pic:blipFill>
+                    <a:blip r:embed="rId10"/>
+                    <a:stretch>
+                      <a:fillRect/>
+                    </a:stretch>
+                  </pic:blipFill>
+                  <pic:spPr>
+                    <a:xfrm>
+                      <a:off x="0" y="0"/>
+                      <a:ext cx="5731510" cy="771525"/>
+                    </a:xfrm>
+                    <a:prstGeom prst="rect">
+                      <a:avLst/>
+                    </a:prstGeom>
+                  </pic:spPr>
+                </pic:pic>
+              </a:graphicData>
+            </a:graphic>
+          </wp:inline>
+        </w:drawing>
+      </w:r>
+    </w:p>
+    <w:p>
+      <w:r>
+        <w:drawing>
+          <wp:inline distT="0" distB="0" distL="0" distR="0" wp14:anchorId="4F699668" wp14:editId="2265779C">
+            <wp:extent cx="5731510" cy="772160"/>
+            <wp:effectExtent l="0" t="0" r="2540" b="8890"/>
+            <wp:docPr id="13622920" name="Picture 1"/>
+            <wp:cNvGraphicFramePr>
+              <a:graphicFrameLocks xmlns:a="http://schemas.openxmlformats.org/drawingml/2006/main" noChangeAspect="1"/>
+            </wp:cNvGraphicFramePr>
+            <a:graphic xmlns:a="http://schemas.openxmlformats.org/drawingml/2006/main">
+              <a:graphicData uri="http://schemas.openxmlformats.org/drawingml/2006/picture">
+                <pic:pic xmlns:pic="http://schemas.openxmlformats.org/drawingml/2006/picture">
+                  <pic:nvPicPr>
+                    <pic:cNvPr id="13622920" name=""/>
+                    <pic:cNvPicPr/>
+                  </pic:nvPicPr>
+                  <pic:blipFill>
+                    <a:blip r:embed="rId11"/>
+                    <a:stretch>
+                      <a:fillRect/>
+                    </a:stretch>
+                  </pic:blipFill>
+                  <pic:spPr>
+                    <a:xfrm>
+                      <a:off x="0" y="0"/>
+                      <a:ext cx="5731510" cy="772160"/>
+                    </a:xfrm>
+                    <a:prstGeom prst="rect">
+                      <a:avLst/>
+                    </a:prstGeom>
+                  </pic:spPr>
+                </pic:pic>
+              </a:graphicData>
+            </a:graphic>
+          </wp:inline>
+        </w:drawing>
+      </w:r>
+    </w:p>
+    <w:p/>
+    <w:p>
       <w:pPr>
         <w:pStyle w:val="ListParagraph"/>
         <w:numPr>
@@ -1318,8 +1486,128 @@
         </w:numPr>
       </w:pPr>
       <w:r>
-        <w:t>Thakasa: Iterator and State pattern, 1 activity diagram and state diagram, GDB/Valgrind task</w:t>
-      </w:r>
+        <w:rPr>
+          <w:b/>
+          <w:bCs/>
+        </w:rPr>
+        <w:t>Thakasa</w:t>
+      </w:r>
+      <w:r>
+        <w:t>: Iterator and State pattern, 1 activity diagram and state diagram, GDB/Valgrind task</w:t>
+      </w:r>
+    </w:p>
+    <w:p>
+      <w:pPr>
+        <w:ind w:left="360"/>
+      </w:pPr>
+      <w:r>
+        <w:drawing>
+          <wp:inline distT="0" distB="0" distL="0" distR="0" wp14:anchorId="2D151509" wp14:editId="3321E5B2">
+            <wp:extent cx="5731510" cy="765810"/>
+            <wp:effectExtent l="0" t="0" r="2540" b="0"/>
+            <wp:docPr id="162906462" name="Picture 1"/>
+            <wp:cNvGraphicFramePr>
+              <a:graphicFrameLocks xmlns:a="http://schemas.openxmlformats.org/drawingml/2006/main" noChangeAspect="1"/>
+            </wp:cNvGraphicFramePr>
+            <a:graphic xmlns:a="http://schemas.openxmlformats.org/drawingml/2006/main">
+              <a:graphicData uri="http://schemas.openxmlformats.org/drawingml/2006/picture">
+                <pic:pic xmlns:pic="http://schemas.openxmlformats.org/drawingml/2006/picture">
+                  <pic:nvPicPr>
+                    <pic:cNvPr id="162906462" name=""/>
+                    <pic:cNvPicPr/>
+                  </pic:nvPicPr>
+                  <pic:blipFill>
+                    <a:blip r:embed="rId12"/>
+                    <a:stretch>
+                      <a:fillRect/>
+                    </a:stretch>
+                  </pic:blipFill>
+                  <pic:spPr>
+                    <a:xfrm>
+                      <a:off x="0" y="0"/>
+                      <a:ext cx="5731510" cy="765810"/>
+                    </a:xfrm>
+                    <a:prstGeom prst="rect">
+                      <a:avLst/>
+                    </a:prstGeom>
+                  </pic:spPr>
+                </pic:pic>
+              </a:graphicData>
+            </a:graphic>
+          </wp:inline>
+        </w:drawing>
+      </w:r>
+    </w:p>
+    <w:p>
+      <w:pPr>
+        <w:ind w:left="360"/>
+      </w:pPr>
+      <w:r>
+        <w:drawing>
+          <wp:inline distT="0" distB="0" distL="0" distR="0" wp14:anchorId="308FA4E0" wp14:editId="01D08D0E">
+            <wp:extent cx="5731510" cy="756285"/>
+            <wp:effectExtent l="0" t="0" r="2540" b="5715"/>
+            <wp:docPr id="942609593" name="Picture 1"/>
+            <wp:cNvGraphicFramePr>
+              <a:graphicFrameLocks xmlns:a="http://schemas.openxmlformats.org/drawingml/2006/main" noChangeAspect="1"/>
+            </wp:cNvGraphicFramePr>
+            <a:graphic xmlns:a="http://schemas.openxmlformats.org/drawingml/2006/main">
+              <a:graphicData uri="http://schemas.openxmlformats.org/drawingml/2006/picture">
+                <pic:pic xmlns:pic="http://schemas.openxmlformats.org/drawingml/2006/picture">
+                  <pic:nvPicPr>
+                    <pic:cNvPr id="942609593" name=""/>
+                    <pic:cNvPicPr/>
+                  </pic:nvPicPr>
+                  <pic:blipFill>
+                    <a:blip r:embed="rId13"/>
+                    <a:stretch>
+                      <a:fillRect/>
+                    </a:stretch>
+                  </pic:blipFill>
+                  <pic:spPr>
+                    <a:xfrm>
+                      <a:off x="0" y="0"/>
+                      <a:ext cx="5731510" cy="756285"/>
+                    </a:xfrm>
+                    <a:prstGeom prst="rect">
+                      <a:avLst/>
+                    </a:prstGeom>
+                  </pic:spPr>
+                </pic:pic>
+              </a:graphicData>
+            </a:graphic>
+          </wp:inline>
+        </w:drawing>
+      </w:r>
+    </w:p>
+    <w:p>
+      <w:pPr>
+        <w:ind w:left="360"/>
+      </w:pPr>
+      <w:r>
+        <w:lastRenderedPageBreak/>
+        <w:t xml:space="preserve">GitHub repo link: </w:t>
+      </w:r>
+      <w:hyperlink r:id="rId14" w:history="1">
+        <w:r>
+          <w:rPr>
+            <w:rStyle w:val="Hyperlink"/>
+          </w:rPr>
+          <w:t>https://github.com/Serg312/COS214</w:t>
+        </w:r>
+        <w:r>
+          <w:rPr>
+            <w:rStyle w:val="Hyperlink"/>
+          </w:rPr>
+          <w:t>-</w:t>
+        </w:r>
+        <w:r>
+          <w:rPr>
+            <w:rStyle w:val="Hyperlink"/>
+          </w:rPr>
+          <w:t>Prac4</w:t>
+        </w:r>
+      </w:hyperlink>
     </w:p>
     <w:p/>
     <w:p/>
@@ -2695,6 +2983,41 @@
       <w:spacing w:val="5"/>
     </w:rPr>
   </w:style>
+  <w:style w:type="character" w:styleId="Hyperlink">
+    <w:name w:val="Hyperlink"/>
+    <w:basedOn w:val="DefaultParagraphFont"/>
+    <w:uiPriority w:val="99"/>
+    <w:unhideWhenUsed/>
+    <w:rsid w:val="00E94A06"/>
+    <w:rPr>
+      <w:color w:val="467886" w:themeColor="hyperlink"/>
+      <w:u w:val="single"/>
+    </w:rPr>
+  </w:style>
+  <w:style w:type="character" w:styleId="UnresolvedMention">
+    <w:name w:val="Unresolved Mention"/>
+    <w:basedOn w:val="DefaultParagraphFont"/>
+    <w:uiPriority w:val="99"/>
+    <w:semiHidden/>
+    <w:unhideWhenUsed/>
+    <w:rsid w:val="00E94A06"/>
+    <w:rPr>
+      <w:color w:val="605E5C"/>
+      <w:shd w:val="clear" w:color="auto" w:fill="E1DFDD"/>
+    </w:rPr>
+  </w:style>
+  <w:style w:type="character" w:styleId="FollowedHyperlink">
+    <w:name w:val="FollowedHyperlink"/>
+    <w:basedOn w:val="DefaultParagraphFont"/>
+    <w:uiPriority w:val="99"/>
+    <w:semiHidden/>
+    <w:unhideWhenUsed/>
+    <w:rsid w:val="00E94A06"/>
+    <w:rPr>
+      <w:color w:val="96607D" w:themeColor="followedHyperlink"/>
+      <w:u w:val="single"/>
+    </w:rPr>
+  </w:style>
 </w:styles>
 </file>
 

</xml_diff>

<commit_message>
forgot to add the uml
</commit_message>
<xml_diff>
--- a/Prac4.docx
+++ b/Prac4.docx
@@ -138,7 +138,53 @@
     </w:p>
     <w:p>
       <w:r>
-        <w:t>*will be done later</w:t>
+        <w:rPr>
+          <w:noProof/>
+        </w:rPr>
+        <w:drawing>
+          <wp:inline distT="0" distB="0" distL="0" distR="0" wp14:anchorId="31922413" wp14:editId="370893A5">
+            <wp:extent cx="5731510" cy="1937385"/>
+            <wp:effectExtent l="0" t="0" r="2540" b="5715"/>
+            <wp:docPr id="91538777" name="Picture 3"/>
+            <wp:cNvGraphicFramePr>
+              <a:graphicFrameLocks xmlns:a="http://schemas.openxmlformats.org/drawingml/2006/main" noChangeAspect="1"/>
+            </wp:cNvGraphicFramePr>
+            <a:graphic xmlns:a="http://schemas.openxmlformats.org/drawingml/2006/main">
+              <a:graphicData uri="http://schemas.openxmlformats.org/drawingml/2006/picture">
+                <pic:pic xmlns:pic="http://schemas.openxmlformats.org/drawingml/2006/picture">
+                  <pic:nvPicPr>
+                    <pic:cNvPr id="91538777" name="Picture 91538777"/>
+                    <pic:cNvPicPr/>
+                  </pic:nvPicPr>
+                  <pic:blipFill>
+                    <a:blip r:embed="rId5" cstate="print">
+                      <a:extLst>
+                        <a:ext uri="{28A0092B-C50C-407E-A947-70E740481C1C}">
+                          <a14:useLocalDpi xmlns:a14="http://schemas.microsoft.com/office/drawing/2010/main" val="0"/>
+                        </a:ext>
+                      </a:extLst>
+                    </a:blip>
+                    <a:stretch>
+                      <a:fillRect/>
+                    </a:stretch>
+                  </pic:blipFill>
+                  <pic:spPr>
+                    <a:xfrm>
+                      <a:off x="0" y="0"/>
+                      <a:ext cx="5731510" cy="1937385"/>
+                    </a:xfrm>
+                    <a:prstGeom prst="rect">
+                      <a:avLst/>
+                    </a:prstGeom>
+                  </pic:spPr>
+                </pic:pic>
+              </a:graphicData>
+            </a:graphic>
+          </wp:inline>
+        </w:drawing>
+      </w:r>
+      <w:r>
+        <w:t xml:space="preserve"> </w:t>
       </w:r>
     </w:p>
     <w:p/>
@@ -231,6 +277,7 @@
           <w:iCs/>
           <w:u w:val="single"/>
         </w:rPr>
+        <w:lastRenderedPageBreak/>
         <w:t>Composite</w:t>
       </w:r>
       <w:r>
@@ -354,7 +401,6 @@
           <w:iCs/>
           <w:u w:val="single"/>
         </w:rPr>
-        <w:lastRenderedPageBreak/>
         <w:t>ConcreteComponent:</w:t>
       </w:r>
       <w:r>
@@ -980,7 +1026,6 @@
           <w:szCs w:val="28"/>
           <w:u w:val="single"/>
         </w:rPr>
-        <w:lastRenderedPageBreak/>
         <w:t>Rationale:</w:t>
       </w:r>
     </w:p>
@@ -1068,13 +1113,29 @@
         <w:t xml:space="preserve"> </w:t>
       </w:r>
       <w:r>
-        <w:t>node's children onto the stack during next(), any structural</w:t>
+        <w:t xml:space="preserve">node's children onto the stack during </w:t>
+      </w:r>
+      <w:proofErr w:type="gramStart"/>
+      <w:r>
+        <w:t>next(</w:t>
+      </w:r>
+      <w:proofErr w:type="gramEnd"/>
+      <w:r>
+        <w:t>), any structural</w:t>
       </w:r>
       <w:r>
         <w:t xml:space="preserve"> </w:t>
       </w:r>
       <w:r>
-        <w:t>changes (like removing an Operation) made to a group befor</w:t>
+        <w:t xml:space="preserve">changes (like removing an </w:t>
+      </w:r>
+      <w:proofErr w:type="gramStart"/>
+      <w:r>
+        <w:t>Operation</w:t>
+      </w:r>
+      <w:proofErr w:type="gramEnd"/>
+      <w:r>
+        <w:t>) made to a group befor</w:t>
       </w:r>
       <w:r>
         <w:t xml:space="preserve">e </w:t>
@@ -1187,7 +1248,7 @@
                     <pic:cNvPicPr/>
                   </pic:nvPicPr>
                   <pic:blipFill>
-                    <a:blip r:embed="rId5"/>
+                    <a:blip r:embed="rId6"/>
                     <a:stretch>
                       <a:fillRect/>
                     </a:stretch>
@@ -1251,7 +1312,7 @@
                     <pic:cNvPicPr/>
                   </pic:nvPicPr>
                   <pic:blipFill>
-                    <a:blip r:embed="rId6">
+                    <a:blip r:embed="rId7">
                       <a:extLst>
                         <a:ext uri="{28A0092B-C50C-407E-A947-70E740481C1C}">
                           <a14:useLocalDpi xmlns:a14="http://schemas.microsoft.com/office/drawing/2010/main" val="0"/>
@@ -1333,7 +1394,7 @@
                     <pic:cNvPicPr/>
                   </pic:nvPicPr>
                   <pic:blipFill>
-                    <a:blip r:embed="rId7"/>
+                    <a:blip r:embed="rId8"/>
                     <a:stretch>
                       <a:fillRect/>
                     </a:stretch>
@@ -1417,7 +1478,7 @@
                     <pic:cNvPicPr/>
                   </pic:nvPicPr>
                   <pic:blipFill>
-                    <a:blip r:embed="rId8"/>
+                    <a:blip r:embed="rId9"/>
                     <a:stretch>
                       <a:fillRect/>
                     </a:stretch>
@@ -1496,7 +1557,7 @@
                     <pic:cNvPicPr/>
                   </pic:nvPicPr>
                   <pic:blipFill>
-                    <a:blip r:embed="rId9" cstate="print">
+                    <a:blip r:embed="rId10" cstate="print">
                       <a:extLst>
                         <a:ext uri="{28A0092B-C50C-407E-A947-70E740481C1C}">
                           <a14:useLocalDpi xmlns:a14="http://schemas.microsoft.com/office/drawing/2010/main" val="0"/>
@@ -1615,7 +1676,7 @@
                     <pic:cNvPicPr/>
                   </pic:nvPicPr>
                   <pic:blipFill>
-                    <a:blip r:embed="rId10"/>
+                    <a:blip r:embed="rId11"/>
                     <a:stretch>
                       <a:fillRect/>
                     </a:stretch>
@@ -1657,7 +1718,7 @@
                     <pic:cNvPicPr/>
                   </pic:nvPicPr>
                   <pic:blipFill>
-                    <a:blip r:embed="rId11"/>
+                    <a:blip r:embed="rId12"/>
                     <a:stretch>
                       <a:fillRect/>
                     </a:stretch>
@@ -1718,7 +1779,7 @@
                     <pic:cNvPicPr/>
                   </pic:nvPicPr>
                   <pic:blipFill>
-                    <a:blip r:embed="rId12"/>
+                    <a:blip r:embed="rId13"/>
                     <a:stretch>
                       <a:fillRect/>
                     </a:stretch>
@@ -1760,7 +1821,7 @@
                     <pic:cNvPicPr/>
                   </pic:nvPicPr>
                   <pic:blipFill>
-                    <a:blip r:embed="rId13"/>
+                    <a:blip r:embed="rId14"/>
                     <a:stretch>
                       <a:fillRect/>
                     </a:stretch>
@@ -1799,7 +1860,15 @@
         <w:t>Thakasa</w:t>
       </w:r>
       <w:r>
-        <w:t>: Iterator and State pattern, 1 activity diagram and state diagram, GDB/Valgrind task</w:t>
+        <w:t>: Iterator and State pattern, 1 activity diagram and state diagram, GDB/</w:t>
+      </w:r>
+      <w:proofErr w:type="spellStart"/>
+      <w:r>
+        <w:t>Valgrind</w:t>
+      </w:r>
+      <w:proofErr w:type="spellEnd"/>
+      <w:r>
+        <w:t xml:space="preserve"> task</w:t>
       </w:r>
     </w:p>
     <w:p>
@@ -1811,7 +1880,7 @@
           <w:noProof/>
         </w:rPr>
         <w:drawing>
-          <wp:inline distT="0" distB="0" distL="0" distR="0" wp14:anchorId="2D151509" wp14:editId="3321E5B2">
+          <wp:inline distT="0" distB="0" distL="0" distR="0" wp14:anchorId="2D151509" wp14:editId="303D9173">
             <wp:extent cx="5731510" cy="765810"/>
             <wp:effectExtent l="0" t="0" r="2540" b="0"/>
             <wp:docPr id="162906462" name="Picture 1"/>
@@ -1826,7 +1895,7 @@
                     <pic:cNvPicPr/>
                   </pic:nvPicPr>
                   <pic:blipFill>
-                    <a:blip r:embed="rId14"/>
+                    <a:blip r:embed="rId15"/>
                     <a:stretch>
                       <a:fillRect/>
                     </a:stretch>
@@ -1856,7 +1925,7 @@
           <w:noProof/>
         </w:rPr>
         <w:drawing>
-          <wp:inline distT="0" distB="0" distL="0" distR="0" wp14:anchorId="308FA4E0" wp14:editId="01D08D0E">
+          <wp:inline distT="0" distB="0" distL="0" distR="0" wp14:anchorId="308FA4E0" wp14:editId="4BD63F2A">
             <wp:extent cx="5731510" cy="756285"/>
             <wp:effectExtent l="0" t="0" r="2540" b="5715"/>
             <wp:docPr id="942609593" name="Picture 1"/>
@@ -1871,7 +1940,7 @@
                     <pic:cNvPicPr/>
                   </pic:nvPicPr>
                   <pic:blipFill>
-                    <a:blip r:embed="rId15"/>
+                    <a:blip r:embed="rId16"/>
                     <a:stretch>
                       <a:fillRect/>
                     </a:stretch>
@@ -1899,7 +1968,7 @@
       <w:r>
         <w:t xml:space="preserve">GitHub repo link: </w:t>
       </w:r>
-      <w:hyperlink r:id="rId16" w:history="1">
+      <w:hyperlink r:id="rId17" w:history="1">
         <w:r>
           <w:rPr>
             <w:rStyle w:val="Hyperlink"/>
@@ -1962,7 +2031,15 @@
         <w:ind w:left="360"/>
       </w:pPr>
       <w:r>
-        <w:t xml:space="preserve">• Cause: The next() method in the iterator was attempting to pop an element off the </w:t>
+        <w:t xml:space="preserve">• Cause: The </w:t>
+      </w:r>
+      <w:proofErr w:type="gramStart"/>
+      <w:r>
+        <w:t>next(</w:t>
+      </w:r>
+      <w:proofErr w:type="gramEnd"/>
+      <w:r>
+        <w:t xml:space="preserve">) method in the iterator was attempting to pop an element off the </w:t>
       </w:r>
       <w:proofErr w:type="spellStart"/>
       <w:r>
@@ -1970,7 +2047,15 @@
       </w:r>
       <w:proofErr w:type="spellEnd"/>
       <w:r>
-        <w:t xml:space="preserve"> without verifying if the stack was already empty. If the client called next() one</w:t>
+        <w:t xml:space="preserve"> without verifying if the stack was already empty. If the client called </w:t>
+      </w:r>
+      <w:proofErr w:type="gramStart"/>
+      <w:r>
+        <w:t>next(</w:t>
+      </w:r>
+      <w:proofErr w:type="gramEnd"/>
+      <w:r>
+        <w:t>) one</w:t>
       </w:r>
       <w:r>
         <w:t xml:space="preserve"> </w:t>
@@ -1987,12 +2072,17 @@
         <w:t>• Debugging Evidence: We compiled the project with the -g flag and launched GDB (</w:t>
       </w:r>
       <w:proofErr w:type="spellStart"/>
+      <w:proofErr w:type="gramStart"/>
       <w:r>
         <w:t>gdb</w:t>
       </w:r>
       <w:proofErr w:type="spellEnd"/>
       <w:r>
-        <w:t xml:space="preserve"> ./</w:t>
+        <w:t xml:space="preserve"> .</w:t>
+      </w:r>
+      <w:proofErr w:type="gramEnd"/>
+      <w:r>
+        <w:t>/</w:t>
       </w:r>
       <w:proofErr w:type="spellStart"/>
       <w:r>
@@ -2065,30 +2155,50 @@
         <w:t xml:space="preserve"> </w:t>
       </w:r>
       <w:r>
-        <w:t xml:space="preserve">of the next() and </w:t>
+        <w:t xml:space="preserve">of the </w:t>
+      </w:r>
+      <w:proofErr w:type="gramStart"/>
+      <w:r>
+        <w:t>next(</w:t>
+      </w:r>
+      <w:proofErr w:type="gramEnd"/>
+      <w:r>
+        <w:t xml:space="preserve">) and </w:t>
       </w:r>
       <w:proofErr w:type="spellStart"/>
+      <w:proofErr w:type="gramStart"/>
       <w:r>
         <w:t>currentItem</w:t>
       </w:r>
       <w:proofErr w:type="spellEnd"/>
       <w:r>
-        <w:t>() methods: if (</w:t>
+        <w:t>(</w:t>
+      </w:r>
+      <w:proofErr w:type="gramEnd"/>
+      <w:r>
+        <w:t>) methods: if (</w:t>
       </w:r>
       <w:proofErr w:type="spellStart"/>
+      <w:proofErr w:type="gramStart"/>
       <w:r>
         <w:t>isDone</w:t>
       </w:r>
       <w:proofErr w:type="spellEnd"/>
       <w:r>
-        <w:t>())</w:t>
+        <w:t>(</w:t>
+      </w:r>
+      <w:proofErr w:type="gramEnd"/>
+      <w:r>
+        <w:t>))</w:t>
       </w:r>
       <w:r>
         <w:t xml:space="preserve"> </w:t>
       </w:r>
+      <w:proofErr w:type="gramStart"/>
       <w:r>
         <w:t>return;.</w:t>
       </w:r>
+      <w:proofErr w:type="gramEnd"/>
       <w:r>
         <w:t xml:space="preserve"> </w:t>
       </w:r>
@@ -2107,6 +2217,101 @@
       <w:r>
         <w:t>entirely.</w:t>
       </w:r>
+    </w:p>
+    <w:p>
+      <w:pPr>
+        <w:ind w:left="360"/>
+        <w:rPr>
+          <w:sz w:val="28"/>
+          <w:szCs w:val="28"/>
+        </w:rPr>
+      </w:pPr>
+      <w:r>
+        <w:rPr>
+          <w:sz w:val="28"/>
+          <w:szCs w:val="28"/>
+        </w:rPr>
+        <w:drawing>
+          <wp:anchor distT="0" distB="0" distL="114300" distR="114300" simplePos="0" relativeHeight="251658240" behindDoc="1" locked="0" layoutInCell="1" allowOverlap="1" wp14:anchorId="227149E7" wp14:editId="54BF3468">
+            <wp:simplePos x="0" y="0"/>
+            <wp:positionH relativeFrom="column">
+              <wp:posOffset>213360</wp:posOffset>
+            </wp:positionH>
+            <wp:positionV relativeFrom="paragraph">
+              <wp:posOffset>224790</wp:posOffset>
+            </wp:positionV>
+            <wp:extent cx="5349240" cy="1831875"/>
+            <wp:effectExtent l="0" t="0" r="3810" b="0"/>
+            <wp:wrapNone/>
+            <wp:docPr id="271689352" name="Picture 1"/>
+            <wp:cNvGraphicFramePr>
+              <a:graphicFrameLocks xmlns:a="http://schemas.openxmlformats.org/drawingml/2006/main" noChangeAspect="1"/>
+            </wp:cNvGraphicFramePr>
+            <a:graphic xmlns:a="http://schemas.openxmlformats.org/drawingml/2006/main">
+              <a:graphicData uri="http://schemas.openxmlformats.org/drawingml/2006/picture">
+                <pic:pic xmlns:pic="http://schemas.openxmlformats.org/drawingml/2006/picture">
+                  <pic:nvPicPr>
+                    <pic:cNvPr id="271689352" name=""/>
+                    <pic:cNvPicPr/>
+                  </pic:nvPicPr>
+                  <pic:blipFill>
+                    <a:blip r:embed="rId18">
+                      <a:extLst>
+                        <a:ext uri="{28A0092B-C50C-407E-A947-70E740481C1C}">
+                          <a14:useLocalDpi xmlns:a14="http://schemas.microsoft.com/office/drawing/2010/main" val="0"/>
+                        </a:ext>
+                      </a:extLst>
+                    </a:blip>
+                    <a:stretch>
+                      <a:fillRect/>
+                    </a:stretch>
+                  </pic:blipFill>
+                  <pic:spPr>
+                    <a:xfrm>
+                      <a:off x="0" y="0"/>
+                      <a:ext cx="5349240" cy="1831875"/>
+                    </a:xfrm>
+                    <a:prstGeom prst="rect">
+                      <a:avLst/>
+                    </a:prstGeom>
+                  </pic:spPr>
+                </pic:pic>
+              </a:graphicData>
+            </a:graphic>
+            <wp14:sizeRelH relativeFrom="page">
+              <wp14:pctWidth>0</wp14:pctWidth>
+            </wp14:sizeRelH>
+            <wp14:sizeRelV relativeFrom="page">
+              <wp14:pctHeight>0</wp14:pctHeight>
+            </wp14:sizeRelV>
+          </wp:anchor>
+        </w:drawing>
+      </w:r>
+      <w:proofErr w:type="spellStart"/>
+      <w:r>
+        <w:rPr>
+          <w:sz w:val="28"/>
+          <w:szCs w:val="28"/>
+        </w:rPr>
+        <w:t>Valgrind</w:t>
+      </w:r>
+      <w:proofErr w:type="spellEnd"/>
+      <w:r>
+        <w:rPr>
+          <w:sz w:val="28"/>
+          <w:szCs w:val="28"/>
+        </w:rPr>
+        <w:t>:</w:t>
+      </w:r>
+    </w:p>
+    <w:p>
+      <w:pPr>
+        <w:ind w:left="360"/>
+        <w:rPr>
+          <w:sz w:val="28"/>
+          <w:szCs w:val="28"/>
+        </w:rPr>
+      </w:pPr>
     </w:p>
     <w:p/>
     <w:p/>

</xml_diff>